<commit_message>
Avance F1, documento y mapa conceptual
</commit_message>
<xml_diff>
--- a/docs/informe_f1_f2_grupo_5.docx
+++ b/docs/informe_f1_f2_grupo_5.docx
@@ -807,7 +807,7 @@
               </wp:inline>
             </w:drawing>
           </mc:Choice>
-          <mc:Fallback xmlns:pic="http://schemas.openxmlformats.org/drawingml/2006/picture" xmlns:a="http://schemas.openxmlformats.org/drawingml/2006/main">
+          <mc:Fallback xmlns:a="http://schemas.openxmlformats.org/drawingml/2006/main" xmlns:pic="http://schemas.openxmlformats.org/drawingml/2006/picture">
             <w:pict>
               <v:group id="Group 2" style="width:85.45pt;height:51.55pt;mso-position-horizontal-relative:char;mso-position-vertical-relative:line" coordsize="10852,6546" o:spid="_x0000_s1026" w14:anchorId="42076BD7" o:gfxdata="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">
                 <v:shape id="Graphic 3" style="position:absolute;left:122;top:167;width:2101;height:3099;visibility:visible;mso-wrap-style:square;v-text-anchor:top" coordsize="210185,309880" o:spid="_x0000_s1027" fillcolor="#c6c4c4" stroked="f" path="m209791,l188086,r,184061l181850,232548r-17516,33480l137327,285432r-34712,6261l71098,285811,45396,267038,28085,233684,21742,184061,21742,,,,,185381r8392,58937l30862,282681r32483,20806l101777,309753r41068,-6762l177287,281095r23690,-39451l209791,182219,209791,xe" o:gfxdata="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">
@@ -865,855 +865,3204 @@
     </w:p>
     <w:p>
       <w:pPr>
-        <w:pStyle w:val="Textoindependiente"/>
+        <w:jc w:val="center"/>
+      </w:pPr>
+      <w:r>
+        <w:t>MCDIA500</w:t>
+      </w:r>
+    </w:p>
+    <w:p>
+      <w:pPr>
+        <w:jc w:val="center"/>
+      </w:pPr>
+      <w:r>
+        <w:t>PROGRAMACIÓN PARA LA CIENCIA DE DATOS</w:t>
+      </w:r>
+    </w:p>
+    <w:p>
+      <w:pPr>
+        <w:pStyle w:val="Ttulo"/>
+        <w:jc w:val="center"/>
+      </w:pPr>
+      <w:r>
+        <w:t>Análisis de ofertas en licitaciones públicas del sector Salud</w:t>
+      </w:r>
+    </w:p>
+    <w:p>
+      <w:pPr>
+        <w:jc w:val="center"/>
+      </w:pPr>
+      <w:r>
+        <w:t>Avance del proyecto Fase 1</w:t>
+      </w:r>
+    </w:p>
+    <w:p>
+      <w:pPr>
+        <w:jc w:val="center"/>
+      </w:pPr>
+      <w:r>
+        <w:t>Reporte de marzo de 2026</w:t>
+      </w:r>
+    </w:p>
+    <w:p/>
+    <w:p/>
+    <w:p>
+      <w:pPr>
+        <w:jc w:val="center"/>
+      </w:pPr>
+      <w:r>
+        <w:t>Grupo 5</w:t>
+      </w:r>
+    </w:p>
+    <w:p>
+      <w:pPr>
+        <w:jc w:val="center"/>
+      </w:pPr>
+      <w:r>
+        <w:t>Víctor Bravo Barrera</w:t>
+      </w:r>
+    </w:p>
+    <w:p>
+      <w:pPr>
+        <w:jc w:val="center"/>
+      </w:pPr>
+      <w:r>
+        <w:t>Nayadeth Garrido</w:t>
+      </w:r>
+    </w:p>
+    <w:p>
+      <w:pPr>
+        <w:jc w:val="center"/>
+      </w:pPr>
+      <w:r>
+        <w:t>Alexander Sepulveda</w:t>
+      </w:r>
+    </w:p>
+    <w:p>
+      <w:pPr>
+        <w:jc w:val="center"/>
+      </w:pPr>
+      <w:r>
+        <w:t>Magíster en Ciencia de Datos e Inteligencia Artificial</w:t>
+      </w:r>
+    </w:p>
+    <w:p>
+      <w:pPr>
+        <w:jc w:val="center"/>
+      </w:pPr>
+      <w:r>
+        <w:t>Universidad Andrés Bello</w:t>
+      </w:r>
+    </w:p>
+    <w:p>
+      <w:pPr>
+        <w:jc w:val="center"/>
+      </w:pPr>
+      <w:r>
+        <w:t>Docente: pendiente de completar</w:t>
+      </w:r>
+    </w:p>
+    <w:p>
+      <w:pPr>
+        <w:jc w:val="center"/>
+      </w:pPr>
+      <w:r>
+        <w:t>Fecha: 16 de septiembre de 2026</w:t>
+      </w:r>
+    </w:p>
+    <w:p>
+      <w:r>
+        <w:br w:type="page"/>
+      </w:r>
+    </w:p>
+    <w:p>
+      <w:pPr>
+        <w:pStyle w:val="Ttulo"/>
+      </w:pPr>
+      <w:r>
+        <w:lastRenderedPageBreak/>
+        <w:t>Índice</w:t>
+      </w:r>
+    </w:p>
+    <w:p>
+      <w:pPr>
+        <w:pStyle w:val="TDC1"/>
+        <w:tabs>
+          <w:tab w:val="right" w:leader="dot" w:pos="10373"/>
+        </w:tabs>
         <w:rPr>
-          <w:sz w:val="20"/>
+          <w:rFonts w:asciiTheme="minorHAnsi" w:eastAsiaTheme="minorEastAsia" w:hAnsiTheme="minorHAnsi" w:cstheme="minorBidi"/>
+          <w:noProof/>
+          <w:color w:val="auto"/>
+          <w:kern w:val="2"/>
+          <w:sz w:val="24"/>
+          <w:szCs w:val="24"/>
+          <w:lang w:val="es-CL" w:eastAsia="es-CL"/>
+          <w14:ligatures w14:val="standardContextual"/>
         </w:rPr>
       </w:pPr>
-    </w:p>
-    <w:p>
-      <w:pPr>
-        <w:pStyle w:val="Textoindependiente"/>
+      <w:r>
+        <w:fldChar w:fldCharType="begin"/>
+      </w:r>
+      <w:r>
+        <w:instrText xml:space="preserve"> TOC \o "1-1" \h \z \u </w:instrText>
+      </w:r>
+      <w:r>
+        <w:fldChar w:fldCharType="separate"/>
+      </w:r>
+      <w:hyperlink w:anchor="_Toc240146699" w:history="1">
+        <w:r>
+          <w:rPr>
+            <w:rStyle w:val="Hipervnculo"/>
+            <w:noProof/>
+          </w:rPr>
+          <w:t>Introducción y contextualización</w:t>
+        </w:r>
+        <w:r>
+          <w:rPr>
+            <w:noProof/>
+            <w:webHidden/>
+          </w:rPr>
+          <w:tab/>
+        </w:r>
+        <w:r>
+          <w:rPr>
+            <w:noProof/>
+            <w:webHidden/>
+          </w:rPr>
+          <w:fldChar w:fldCharType="begin"/>
+        </w:r>
+        <w:r>
+          <w:rPr>
+            <w:noProof/>
+            <w:webHidden/>
+          </w:rPr>
+          <w:instrText xml:space="preserve"> PAGEREF _Toc240146699 \h </w:instrText>
+        </w:r>
+        <w:r>
+          <w:rPr>
+            <w:noProof/>
+            <w:webHidden/>
+          </w:rPr>
+        </w:r>
+        <w:r>
+          <w:rPr>
+            <w:noProof/>
+            <w:webHidden/>
+          </w:rPr>
+          <w:fldChar w:fldCharType="separate"/>
+        </w:r>
+        <w:r>
+          <w:rPr>
+            <w:noProof/>
+            <w:webHidden/>
+          </w:rPr>
+          <w:t>3</w:t>
+        </w:r>
+        <w:r>
+          <w:rPr>
+            <w:noProof/>
+            <w:webHidden/>
+          </w:rPr>
+          <w:fldChar w:fldCharType="end"/>
+        </w:r>
+      </w:hyperlink>
+    </w:p>
+    <w:p>
+      <w:pPr>
+        <w:pStyle w:val="TDC1"/>
+        <w:tabs>
+          <w:tab w:val="right" w:leader="dot" w:pos="10373"/>
+        </w:tabs>
         <w:rPr>
-          <w:sz w:val="20"/>
+          <w:rFonts w:asciiTheme="minorHAnsi" w:eastAsiaTheme="minorEastAsia" w:hAnsiTheme="minorHAnsi" w:cstheme="minorBidi"/>
+          <w:noProof/>
+          <w:color w:val="auto"/>
+          <w:kern w:val="2"/>
+          <w:sz w:val="24"/>
+          <w:szCs w:val="24"/>
+          <w:lang w:val="es-CL" w:eastAsia="es-CL"/>
+          <w14:ligatures w14:val="standardContextual"/>
         </w:rPr>
       </w:pPr>
-    </w:p>
-    <w:p>
-      <w:pPr>
-        <w:pStyle w:val="Textoindependiente"/>
-        <w:spacing w:before="4"/>
+      <w:hyperlink w:anchor="_Toc240146700" w:history="1">
+        <w:r>
+          <w:rPr>
+            <w:rStyle w:val="Hipervnculo"/>
+            <w:noProof/>
+          </w:rPr>
+          <w:t>Datos y alcance del análisis</w:t>
+        </w:r>
+        <w:r>
+          <w:rPr>
+            <w:noProof/>
+            <w:webHidden/>
+          </w:rPr>
+          <w:tab/>
+        </w:r>
+        <w:r>
+          <w:rPr>
+            <w:noProof/>
+            <w:webHidden/>
+          </w:rPr>
+          <w:fldChar w:fldCharType="begin"/>
+        </w:r>
+        <w:r>
+          <w:rPr>
+            <w:noProof/>
+            <w:webHidden/>
+          </w:rPr>
+          <w:instrText xml:space="preserve"> PAGEREF _Toc240146700 \h </w:instrText>
+        </w:r>
+        <w:r>
+          <w:rPr>
+            <w:noProof/>
+            <w:webHidden/>
+          </w:rPr>
+        </w:r>
+        <w:r>
+          <w:rPr>
+            <w:noProof/>
+            <w:webHidden/>
+          </w:rPr>
+          <w:fldChar w:fldCharType="separate"/>
+        </w:r>
+        <w:r>
+          <w:rPr>
+            <w:noProof/>
+            <w:webHidden/>
+          </w:rPr>
+          <w:t>4</w:t>
+        </w:r>
+        <w:r>
+          <w:rPr>
+            <w:noProof/>
+            <w:webHidden/>
+          </w:rPr>
+          <w:fldChar w:fldCharType="end"/>
+        </w:r>
+      </w:hyperlink>
+    </w:p>
+    <w:p>
+      <w:pPr>
+        <w:pStyle w:val="TDC1"/>
+        <w:tabs>
+          <w:tab w:val="right" w:leader="dot" w:pos="10373"/>
+        </w:tabs>
         <w:rPr>
-          <w:sz w:val="26"/>
+          <w:rFonts w:asciiTheme="minorHAnsi" w:eastAsiaTheme="minorEastAsia" w:hAnsiTheme="minorHAnsi" w:cstheme="minorBidi"/>
+          <w:noProof/>
+          <w:color w:val="auto"/>
+          <w:kern w:val="2"/>
+          <w:sz w:val="24"/>
+          <w:szCs w:val="24"/>
+          <w:lang w:val="es-CL" w:eastAsia="es-CL"/>
+          <w14:ligatures w14:val="standardContextual"/>
         </w:rPr>
       </w:pPr>
-    </w:p>
-    <w:p>
-      <w:pPr>
-        <w:pBdr>
-          <w:top w:val="nil"/>
-          <w:left w:val="nil"/>
-          <w:bottom w:val="nil"/>
-          <w:right w:val="nil"/>
-          <w:between w:val="nil"/>
-        </w:pBdr>
-        <w:spacing w:before="210"/>
+      <w:hyperlink w:anchor="_Toc240146701" w:history="1">
+        <w:r>
+          <w:rPr>
+            <w:rStyle w:val="Hipervnculo"/>
+            <w:noProof/>
+          </w:rPr>
+          <w:t>Herramientas y entorno reproducible</w:t>
+        </w:r>
+        <w:r>
+          <w:rPr>
+            <w:noProof/>
+            <w:webHidden/>
+          </w:rPr>
+          <w:tab/>
+        </w:r>
+        <w:r>
+          <w:rPr>
+            <w:noProof/>
+            <w:webHidden/>
+          </w:rPr>
+          <w:fldChar w:fldCharType="begin"/>
+        </w:r>
+        <w:r>
+          <w:rPr>
+            <w:noProof/>
+            <w:webHidden/>
+          </w:rPr>
+          <w:instrText xml:space="preserve"> PAGEREF _Toc240146701 \h </w:instrText>
+        </w:r>
+        <w:r>
+          <w:rPr>
+            <w:noProof/>
+            <w:webHidden/>
+          </w:rPr>
+        </w:r>
+        <w:r>
+          <w:rPr>
+            <w:noProof/>
+            <w:webHidden/>
+          </w:rPr>
+          <w:fldChar w:fldCharType="separate"/>
+        </w:r>
+        <w:r>
+          <w:rPr>
+            <w:noProof/>
+            <w:webHidden/>
+          </w:rPr>
+          <w:t>6</w:t>
+        </w:r>
+        <w:r>
+          <w:rPr>
+            <w:noProof/>
+            <w:webHidden/>
+          </w:rPr>
+          <w:fldChar w:fldCharType="end"/>
+        </w:r>
+      </w:hyperlink>
+    </w:p>
+    <w:p>
+      <w:pPr>
+        <w:pStyle w:val="TDC1"/>
+        <w:tabs>
+          <w:tab w:val="right" w:leader="dot" w:pos="10373"/>
+        </w:tabs>
         <w:rPr>
-          <w:b/>
-          <w:bCs/>
-          <w:color w:val="000000" w:themeColor="text1"/>
-          <w:sz w:val="72"/>
-          <w:szCs w:val="72"/>
+          <w:rFonts w:asciiTheme="minorHAnsi" w:eastAsiaTheme="minorEastAsia" w:hAnsiTheme="minorHAnsi" w:cstheme="minorBidi"/>
+          <w:noProof/>
+          <w:color w:val="auto"/>
+          <w:kern w:val="2"/>
+          <w:sz w:val="24"/>
+          <w:szCs w:val="24"/>
+          <w:lang w:val="es-CL" w:eastAsia="es-CL"/>
+          <w14:ligatures w14:val="standardContextual"/>
         </w:rPr>
       </w:pPr>
-    </w:p>
-    <w:p>
-      <w:pPr>
-        <w:pBdr>
-          <w:top w:val="nil"/>
-          <w:left w:val="nil"/>
-          <w:bottom w:val="nil"/>
-          <w:right w:val="nil"/>
-          <w:between w:val="nil"/>
-        </w:pBdr>
-        <w:spacing w:before="210"/>
+      <w:hyperlink w:anchor="_Toc240146702" w:history="1">
+        <w:r>
+          <w:rPr>
+            <w:rStyle w:val="Hipervnculo"/>
+            <w:noProof/>
+          </w:rPr>
+          <w:t>Validación técnica y resultados de F1</w:t>
+        </w:r>
+        <w:r>
+          <w:rPr>
+            <w:noProof/>
+            <w:webHidden/>
+          </w:rPr>
+          <w:tab/>
+        </w:r>
+        <w:r>
+          <w:rPr>
+            <w:noProof/>
+            <w:webHidden/>
+          </w:rPr>
+          <w:fldChar w:fldCharType="begin"/>
+        </w:r>
+        <w:r>
+          <w:rPr>
+            <w:noProof/>
+            <w:webHidden/>
+          </w:rPr>
+          <w:instrText xml:space="preserve"> PAGEREF _Toc240146702 \h </w:instrText>
+        </w:r>
+        <w:r>
+          <w:rPr>
+            <w:noProof/>
+            <w:webHidden/>
+          </w:rPr>
+        </w:r>
+        <w:r>
+          <w:rPr>
+            <w:noProof/>
+            <w:webHidden/>
+          </w:rPr>
+          <w:fldChar w:fldCharType="separate"/>
+        </w:r>
+        <w:r>
+          <w:rPr>
+            <w:noProof/>
+            <w:webHidden/>
+          </w:rPr>
+          <w:t>7</w:t>
+        </w:r>
+        <w:r>
+          <w:rPr>
+            <w:noProof/>
+            <w:webHidden/>
+          </w:rPr>
+          <w:fldChar w:fldCharType="end"/>
+        </w:r>
+      </w:hyperlink>
+    </w:p>
+    <w:p>
+      <w:pPr>
+        <w:pStyle w:val="TDC1"/>
+        <w:tabs>
+          <w:tab w:val="right" w:leader="dot" w:pos="10373"/>
+        </w:tabs>
         <w:rPr>
-          <w:b/>
-          <w:bCs/>
-          <w:color w:val="000000" w:themeColor="text1"/>
-          <w:sz w:val="72"/>
-          <w:szCs w:val="72"/>
+          <w:rFonts w:asciiTheme="minorHAnsi" w:eastAsiaTheme="minorEastAsia" w:hAnsiTheme="minorHAnsi" w:cstheme="minorBidi"/>
+          <w:noProof/>
+          <w:color w:val="auto"/>
+          <w:kern w:val="2"/>
+          <w:sz w:val="24"/>
+          <w:szCs w:val="24"/>
+          <w:lang w:val="es-CL" w:eastAsia="es-CL"/>
+          <w14:ligatures w14:val="standardContextual"/>
         </w:rPr>
       </w:pPr>
-    </w:p>
-    <w:p>
-      <w:pPr>
-        <w:pBdr>
-          <w:top w:val="nil"/>
-          <w:left w:val="nil"/>
-          <w:bottom w:val="nil"/>
-          <w:right w:val="nil"/>
-          <w:between w:val="nil"/>
-        </w:pBdr>
-        <w:spacing w:before="210"/>
+      <w:hyperlink w:anchor="_Toc240146703" w:history="1">
+        <w:r>
+          <w:rPr>
+            <w:rStyle w:val="Hipervnculo"/>
+            <w:noProof/>
+          </w:rPr>
+          <w:t>Control de versiones y documentación</w:t>
+        </w:r>
+        <w:r>
+          <w:rPr>
+            <w:noProof/>
+            <w:webHidden/>
+          </w:rPr>
+          <w:tab/>
+        </w:r>
+        <w:r>
+          <w:rPr>
+            <w:noProof/>
+            <w:webHidden/>
+          </w:rPr>
+          <w:fldChar w:fldCharType="begin"/>
+        </w:r>
+        <w:r>
+          <w:rPr>
+            <w:noProof/>
+            <w:webHidden/>
+          </w:rPr>
+          <w:instrText xml:space="preserve"> PAGEREF _Toc240146703 \h </w:instrText>
+        </w:r>
+        <w:r>
+          <w:rPr>
+            <w:noProof/>
+            <w:webHidden/>
+          </w:rPr>
+        </w:r>
+        <w:r>
+          <w:rPr>
+            <w:noProof/>
+            <w:webHidden/>
+          </w:rPr>
+          <w:fldChar w:fldCharType="separate"/>
+        </w:r>
+        <w:r>
+          <w:rPr>
+            <w:noProof/>
+            <w:webHidden/>
+          </w:rPr>
+          <w:t>8</w:t>
+        </w:r>
+        <w:r>
+          <w:rPr>
+            <w:noProof/>
+            <w:webHidden/>
+          </w:rPr>
+          <w:fldChar w:fldCharType="end"/>
+        </w:r>
+      </w:hyperlink>
+    </w:p>
+    <w:p>
+      <w:pPr>
+        <w:pStyle w:val="TDC1"/>
+        <w:tabs>
+          <w:tab w:val="right" w:leader="dot" w:pos="10373"/>
+        </w:tabs>
         <w:rPr>
-          <w:b/>
-          <w:bCs/>
-          <w:color w:val="000000"/>
-          <w:sz w:val="72"/>
-          <w:szCs w:val="72"/>
-          <w:lang w:val="es-CL"/>
+          <w:rFonts w:asciiTheme="minorHAnsi" w:eastAsiaTheme="minorEastAsia" w:hAnsiTheme="minorHAnsi" w:cstheme="minorBidi"/>
+          <w:noProof/>
+          <w:color w:val="auto"/>
+          <w:kern w:val="2"/>
+          <w:sz w:val="24"/>
+          <w:szCs w:val="24"/>
+          <w:lang w:val="es-CL" w:eastAsia="es-CL"/>
+          <w14:ligatures w14:val="standardContextual"/>
         </w:rPr>
       </w:pPr>
-      <w:r>
+      <w:hyperlink w:anchor="_Toc240146704" w:history="1">
+        <w:r>
+          <w:rPr>
+            <w:rStyle w:val="Hipervnculo"/>
+            <w:noProof/>
+          </w:rPr>
+          <w:t>Vinculación con el mapa conceptual</w:t>
+        </w:r>
+        <w:r>
+          <w:rPr>
+            <w:noProof/>
+            <w:webHidden/>
+          </w:rPr>
+          <w:tab/>
+        </w:r>
+        <w:r>
+          <w:rPr>
+            <w:noProof/>
+            <w:webHidden/>
+          </w:rPr>
+          <w:fldChar w:fldCharType="begin"/>
+        </w:r>
+        <w:r>
+          <w:rPr>
+            <w:noProof/>
+            <w:webHidden/>
+          </w:rPr>
+          <w:instrText xml:space="preserve"> PAGEREF _Toc240146704 \h </w:instrText>
+        </w:r>
+        <w:r>
+          <w:rPr>
+            <w:noProof/>
+            <w:webHidden/>
+          </w:rPr>
+        </w:r>
+        <w:r>
+          <w:rPr>
+            <w:noProof/>
+            <w:webHidden/>
+          </w:rPr>
+          <w:fldChar w:fldCharType="separate"/>
+        </w:r>
+        <w:r>
+          <w:rPr>
+            <w:noProof/>
+            <w:webHidden/>
+          </w:rPr>
+          <w:t>9</w:t>
+        </w:r>
+        <w:r>
+          <w:rPr>
+            <w:noProof/>
+            <w:webHidden/>
+          </w:rPr>
+          <w:fldChar w:fldCharType="end"/>
+        </w:r>
+      </w:hyperlink>
+    </w:p>
+    <w:p>
+      <w:pPr>
+        <w:pStyle w:val="TDC1"/>
+        <w:tabs>
+          <w:tab w:val="right" w:leader="dot" w:pos="10373"/>
+        </w:tabs>
         <w:rPr>
-          <w:b/>
-          <w:bCs/>
-          <w:color w:val="000000" w:themeColor="text1"/>
-          <w:sz w:val="72"/>
-          <w:szCs w:val="72"/>
+          <w:rFonts w:asciiTheme="minorHAnsi" w:eastAsiaTheme="minorEastAsia" w:hAnsiTheme="minorHAnsi" w:cstheme="minorBidi"/>
+          <w:noProof/>
+          <w:color w:val="auto"/>
+          <w:kern w:val="2"/>
+          <w:sz w:val="24"/>
+          <w:szCs w:val="24"/>
+          <w:lang w:val="es-CL" w:eastAsia="es-CL"/>
+          <w14:ligatures w14:val="standardContextual"/>
         </w:rPr>
-        <w:t>MCDIA500</w:t>
-      </w:r>
+      </w:pPr>
+      <w:hyperlink w:anchor="_Toc240146705" w:history="1">
+        <w:r>
+          <w:rPr>
+            <w:rStyle w:val="Hipervnculo"/>
+            <w:noProof/>
+          </w:rPr>
+          <w:t>Referencias</w:t>
+        </w:r>
+        <w:r>
+          <w:rPr>
+            <w:noProof/>
+            <w:webHidden/>
+          </w:rPr>
+          <w:tab/>
+        </w:r>
+        <w:r>
+          <w:rPr>
+            <w:noProof/>
+            <w:webHidden/>
+          </w:rPr>
+          <w:fldChar w:fldCharType="begin"/>
+        </w:r>
+        <w:r>
+          <w:rPr>
+            <w:noProof/>
+            <w:webHidden/>
+          </w:rPr>
+          <w:instrText xml:space="preserve"> PAGEREF _Toc240146705 \h </w:instrText>
+        </w:r>
+        <w:r>
+          <w:rPr>
+            <w:noProof/>
+            <w:webHidden/>
+          </w:rPr>
+        </w:r>
+        <w:r>
+          <w:rPr>
+            <w:noProof/>
+            <w:webHidden/>
+          </w:rPr>
+          <w:fldChar w:fldCharType="separate"/>
+        </w:r>
+        <w:r>
+          <w:rPr>
+            <w:noProof/>
+            <w:webHidden/>
+          </w:rPr>
+          <w:t>10</w:t>
+        </w:r>
+        <w:r>
+          <w:rPr>
+            <w:noProof/>
+            <w:webHidden/>
+          </w:rPr>
+          <w:fldChar w:fldCharType="end"/>
+        </w:r>
+      </w:hyperlink>
+    </w:p>
+    <w:p>
+      <w:r>
+        <w:fldChar w:fldCharType="end"/>
+      </w:r>
+    </w:p>
+    <w:p>
+      <w:r>
+        <w:t>Este avance desarrolla F1. La preparación del conjunto de datos de F2 se incorporará en la siguiente revisión del informe.</w:t>
+      </w:r>
+    </w:p>
+    <w:p>
+      <w:r>
+        <w:br w:type="page"/>
+      </w:r>
+    </w:p>
+    <w:p>
+      <w:pPr>
+        <w:pStyle w:val="Ttulo11"/>
+      </w:pPr>
+      <w:bookmarkStart w:id="0" w:name="_Toc240146699"/>
+      <w:r>
+        <w:lastRenderedPageBreak/>
+        <w:t>Introducción y contextualización</w:t>
+      </w:r>
+      <w:bookmarkEnd w:id="0"/>
+    </w:p>
+    <w:p>
+      <w:r>
+        <w:t>El proyecto estudia las ofertas del reporte de licitaciones del sector Salud de marzo de 2026, obtenido del portal de datos abiertos de ChileCompra. El interés es describir cómo cambia la proporción de ofertas ganadoras entre tipos de licitación y tamaños de proveedor. Esta primera fase delimita la pregunta y establece las condiciones para desarrollar el análisis con datos y código verificables.</w:t>
+      </w:r>
+    </w:p>
+    <w:p>
+      <w:r>
+        <w:t>El reporte reúne información del proceso de compra, los bienes o servicios solicitados y las ofertas recibidas. ChileCompra (s. f.-a) señala que los descargables de licitaciones incluyen sus ofertas. Por eso, contar filas no equivale a contar licitaciones: un proceso puede contener varios ítems y recibir propuestas de distintos proveedores.</w:t>
+      </w:r>
+    </w:p>
+    <w:p>
+      <w:r>
+        <w:t>El archivo contiene 44.226 registros y 74 columnas. Su volumen y la combinación de identificadores, categorías, fechas y montos hacen necesario un tratamiento programático. En esta etapa se verificó que el archivo puede leerse, conserva su integridad y contiene las variables requeridas. Aún no se han calculado las proporciones ni se han aplicado reglas de limpieza.</w:t>
+      </w:r>
+    </w:p>
+    <w:p>
+      <w:pPr>
+        <w:pStyle w:val="Ttulo21"/>
+      </w:pPr>
+      <w:r>
+        <w:t>Problema y pregunta de análisis</w:t>
+      </w:r>
+    </w:p>
+    <w:p>
+      <w:r>
+        <w:t>La comparación de ofertas requiere precisar qué representa cada registro y qué significa su resultado. Las categorías de tamaño, los estados del proceso y los posibles registros repetidos deben revisarse antes de interpretar diferencias entre grupos.</w:t>
+      </w:r>
+    </w:p>
+    <w:p>
+      <w:r>
+        <w:t>La pregunta central es: ¿cómo varía la proporción de ofertas ganadoras según el tipo de licitación y el tamaño del proveedor en el reporte del sector Salud de marzo de 2026?</w:t>
+      </w:r>
+    </w:p>
+    <w:p>
+      <w:pPr>
+        <w:pStyle w:val="Ttulo21"/>
+      </w:pPr>
+      <w:r>
+        <w:t>Objetivos del proyecto</w:t>
+      </w:r>
+    </w:p>
+    <w:p>
+      <w:r>
+        <w:t>El objetivo general es analizar descriptivamente esas diferencias mediante un flujo reproducible que permita comprobar la calidad de los datos y los resultados.</w:t>
+      </w:r>
+    </w:p>
+    <w:p>
+      <w:pPr>
+        <w:pStyle w:val="Listaconvietas1"/>
+      </w:pPr>
+      <w:r>
+        <w:t>Delimitar el problema, la unidad de análisis, las variables y los supuestos, y configurar el entorno de trabajo reproducible en F1.</w:t>
+      </w:r>
+    </w:p>
+    <w:p>
+      <w:pPr>
+        <w:pStyle w:val="Listaconvietas1"/>
+      </w:pPr>
+      <w:r>
+        <w:t>Caracterizar la calidad del archivo y preparar un conjunto validado mediante reglas justificadas en F2.</w:t>
+      </w:r>
+    </w:p>
+    <w:p>
+      <w:pPr>
+        <w:pStyle w:val="Listaconvietas1"/>
+      </w:pPr>
+      <w:r>
+        <w:t>Calcular y representar distribuciones y proporciones por tipo de licitación y tamaño del proveedor en la fase de análisis.</w:t>
+      </w:r>
+    </w:p>
+    <w:p>
+      <w:pPr>
+        <w:pStyle w:val="Listaconvietas1"/>
+      </w:pPr>
+      <w:r>
+        <w:t>Integrar resultados, limitaciones y evidencias en el informe y el repositorio del proyecto.</w:t>
+      </w:r>
+    </w:p>
+    <w:p>
+      <w:r>
+        <w:br w:type="page"/>
+      </w:r>
+    </w:p>
+    <w:p>
+      <w:pPr>
+        <w:pStyle w:val="Ttulo11"/>
+      </w:pPr>
+      <w:bookmarkStart w:id="1" w:name="_Toc240146700"/>
+      <w:r>
+        <w:lastRenderedPageBreak/>
+        <w:t>Datos y alcance del análisis</w:t>
+      </w:r>
+      <w:bookmarkEnd w:id="1"/>
+    </w:p>
+    <w:p>
+      <w:r>
+        <w:t>La unidad de análisis de trabajo es una oferta asociada a un ítem de licitación. NroLicitacion identifica el proceso y puede repetirse legítimamente. La clave que distingue cada observación se contrastará durante F2; no se eliminarán registros solo por compartir ese identificador.</w:t>
+      </w:r>
+    </w:p>
+    <w:tbl>
+      <w:tblPr>
+        <w:tblW w:w="0" w:type="auto"/>
+        <w:jc w:val="center"/>
+        <w:tblBorders>
+          <w:top w:val="single" w:sz="4" w:space="0" w:color="D9D9D9"/>
+          <w:left w:val="single" w:sz="4" w:space="0" w:color="D9D9D9"/>
+          <w:bottom w:val="single" w:sz="4" w:space="0" w:color="D9D9D9"/>
+          <w:right w:val="single" w:sz="4" w:space="0" w:color="D9D9D9"/>
+          <w:insideH w:val="single" w:sz="4" w:space="0" w:color="D9D9D9"/>
+          <w:insideV w:val="single" w:sz="4" w:space="0" w:color="D9D9D9"/>
+        </w:tblBorders>
+        <w:tblLayout w:type="fixed"/>
+        <w:tblLook w:val="04A0" w:firstRow="1" w:lastRow="0" w:firstColumn="1" w:lastColumn="0" w:noHBand="0" w:noVBand="1"/>
+      </w:tblPr>
+      <w:tblGrid>
+        <w:gridCol w:w="2376"/>
+        <w:gridCol w:w="7848"/>
+      </w:tblGrid>
+      <w:tr>
+        <w:trPr>
+          <w:cantSplit/>
+          <w:tblHeader/>
+          <w:jc w:val="center"/>
+        </w:trPr>
+        <w:tc>
+          <w:tcPr>
+            <w:tcW w:w="2376" w:type="dxa"/>
+            <w:shd w:val="clear" w:color="auto" w:fill="E7EEF4"/>
+            <w:tcMar>
+              <w:top w:w="90" w:type="dxa"/>
+              <w:left w:w="90" w:type="dxa"/>
+              <w:bottom w:w="90" w:type="dxa"/>
+              <w:right w:w="90" w:type="dxa"/>
+            </w:tcMar>
+            <w:vAlign w:val="center"/>
+          </w:tcPr>
+          <w:p>
+            <w:pPr>
+              <w:spacing w:after="40" w:line="247" w:lineRule="auto"/>
+            </w:pPr>
+            <w:r>
+              <w:rPr>
+                <w:b/>
+                <w:sz w:val="20"/>
+              </w:rPr>
+              <w:t>Característica</w:t>
+            </w:r>
+          </w:p>
+        </w:tc>
+        <w:tc>
+          <w:tcPr>
+            <w:tcW w:w="7848" w:type="dxa"/>
+            <w:shd w:val="clear" w:color="auto" w:fill="E7EEF4"/>
+            <w:tcMar>
+              <w:top w:w="90" w:type="dxa"/>
+              <w:left w:w="90" w:type="dxa"/>
+              <w:bottom w:w="90" w:type="dxa"/>
+              <w:right w:w="90" w:type="dxa"/>
+            </w:tcMar>
+            <w:vAlign w:val="center"/>
+          </w:tcPr>
+          <w:p>
+            <w:pPr>
+              <w:spacing w:after="40" w:line="247" w:lineRule="auto"/>
+            </w:pPr>
+            <w:r>
+              <w:rPr>
+                <w:b/>
+                <w:sz w:val="20"/>
+              </w:rPr>
+              <w:t>Descripción</w:t>
+            </w:r>
+          </w:p>
+        </w:tc>
+      </w:tr>
+      <w:tr>
+        <w:trPr>
+          <w:cantSplit/>
+          <w:jc w:val="center"/>
+        </w:trPr>
+        <w:tc>
+          <w:tcPr>
+            <w:tcW w:w="2376" w:type="dxa"/>
+            <w:shd w:val="clear" w:color="auto" w:fill="FFFFFF"/>
+            <w:tcMar>
+              <w:top w:w="90" w:type="dxa"/>
+              <w:left w:w="90" w:type="dxa"/>
+              <w:bottom w:w="90" w:type="dxa"/>
+              <w:right w:w="90" w:type="dxa"/>
+            </w:tcMar>
+            <w:vAlign w:val="center"/>
+          </w:tcPr>
+          <w:p>
+            <w:pPr>
+              <w:spacing w:after="40" w:line="247" w:lineRule="auto"/>
+            </w:pPr>
+            <w:r>
+              <w:rPr>
+                <w:sz w:val="20"/>
+              </w:rPr>
+              <w:t>Archivo</w:t>
+            </w:r>
+          </w:p>
+        </w:tc>
+        <w:tc>
+          <w:tcPr>
+            <w:tcW w:w="7848" w:type="dxa"/>
+            <w:shd w:val="clear" w:color="auto" w:fill="FFFFFF"/>
+            <w:tcMar>
+              <w:top w:w="90" w:type="dxa"/>
+              <w:left w:w="90" w:type="dxa"/>
+              <w:bottom w:w="90" w:type="dxa"/>
+              <w:right w:w="90" w:type="dxa"/>
+            </w:tcMar>
+            <w:vAlign w:val="center"/>
+          </w:tcPr>
+          <w:p>
+            <w:pPr>
+              <w:spacing w:after="40" w:line="247" w:lineRule="auto"/>
+            </w:pPr>
+            <w:r>
+              <w:rPr>
+                <w:sz w:val="20"/>
+              </w:rPr>
+              <w:t>licitaciones_salud_marzo_2026.csv</w:t>
+            </w:r>
+          </w:p>
+        </w:tc>
+      </w:tr>
+      <w:tr>
+        <w:trPr>
+          <w:cantSplit/>
+          <w:jc w:val="center"/>
+        </w:trPr>
+        <w:tc>
+          <w:tcPr>
+            <w:tcW w:w="2376" w:type="dxa"/>
+            <w:shd w:val="clear" w:color="auto" w:fill="FFFFFF"/>
+            <w:tcMar>
+              <w:top w:w="90" w:type="dxa"/>
+              <w:left w:w="90" w:type="dxa"/>
+              <w:bottom w:w="90" w:type="dxa"/>
+              <w:right w:w="90" w:type="dxa"/>
+            </w:tcMar>
+            <w:vAlign w:val="center"/>
+          </w:tcPr>
+          <w:p>
+            <w:pPr>
+              <w:spacing w:after="40" w:line="247" w:lineRule="auto"/>
+            </w:pPr>
+            <w:r>
+              <w:rPr>
+                <w:sz w:val="20"/>
+              </w:rPr>
+              <w:t>Fuente</w:t>
+            </w:r>
+          </w:p>
+        </w:tc>
+        <w:tc>
+          <w:tcPr>
+            <w:tcW w:w="7848" w:type="dxa"/>
+            <w:shd w:val="clear" w:color="auto" w:fill="FFFFFF"/>
+            <w:tcMar>
+              <w:top w:w="90" w:type="dxa"/>
+              <w:left w:w="90" w:type="dxa"/>
+              <w:bottom w:w="90" w:type="dxa"/>
+              <w:right w:w="90" w:type="dxa"/>
+            </w:tcMar>
+            <w:vAlign w:val="center"/>
+          </w:tcPr>
+          <w:p>
+            <w:pPr>
+              <w:spacing w:after="40" w:line="247" w:lineRule="auto"/>
+            </w:pPr>
+            <w:r>
+              <w:rPr>
+                <w:sz w:val="20"/>
+              </w:rPr>
+              <w:t>Portal de Datos Abiertos de ChileCompra</w:t>
+            </w:r>
+          </w:p>
+        </w:tc>
+      </w:tr>
+      <w:tr>
+        <w:trPr>
+          <w:cantSplit/>
+          <w:jc w:val="center"/>
+        </w:trPr>
+        <w:tc>
+          <w:tcPr>
+            <w:tcW w:w="2376" w:type="dxa"/>
+            <w:shd w:val="clear" w:color="auto" w:fill="FFFFFF"/>
+            <w:tcMar>
+              <w:top w:w="90" w:type="dxa"/>
+              <w:left w:w="90" w:type="dxa"/>
+              <w:bottom w:w="90" w:type="dxa"/>
+              <w:right w:w="90" w:type="dxa"/>
+            </w:tcMar>
+            <w:vAlign w:val="center"/>
+          </w:tcPr>
+          <w:p>
+            <w:pPr>
+              <w:spacing w:after="40" w:line="247" w:lineRule="auto"/>
+            </w:pPr>
+            <w:r>
+              <w:rPr>
+                <w:sz w:val="20"/>
+              </w:rPr>
+              <w:t>Dimensiones</w:t>
+            </w:r>
+          </w:p>
+        </w:tc>
+        <w:tc>
+          <w:tcPr>
+            <w:tcW w:w="7848" w:type="dxa"/>
+            <w:shd w:val="clear" w:color="auto" w:fill="FFFFFF"/>
+            <w:tcMar>
+              <w:top w:w="90" w:type="dxa"/>
+              <w:left w:w="90" w:type="dxa"/>
+              <w:bottom w:w="90" w:type="dxa"/>
+              <w:right w:w="90" w:type="dxa"/>
+            </w:tcMar>
+            <w:vAlign w:val="center"/>
+          </w:tcPr>
+          <w:p>
+            <w:pPr>
+              <w:spacing w:after="40" w:line="247" w:lineRule="auto"/>
+            </w:pPr>
+            <w:r>
+              <w:rPr>
+                <w:sz w:val="20"/>
+              </w:rPr>
+              <w:t>44.226 filas y 74 columnas</w:t>
+            </w:r>
+          </w:p>
+        </w:tc>
+      </w:tr>
+      <w:tr>
+        <w:trPr>
+          <w:cantSplit/>
+          <w:jc w:val="center"/>
+        </w:trPr>
+        <w:tc>
+          <w:tcPr>
+            <w:tcW w:w="2376" w:type="dxa"/>
+            <w:shd w:val="clear" w:color="auto" w:fill="FFFFFF"/>
+            <w:tcMar>
+              <w:top w:w="90" w:type="dxa"/>
+              <w:left w:w="90" w:type="dxa"/>
+              <w:bottom w:w="90" w:type="dxa"/>
+              <w:right w:w="90" w:type="dxa"/>
+            </w:tcMar>
+            <w:vAlign w:val="center"/>
+          </w:tcPr>
+          <w:p>
+            <w:pPr>
+              <w:spacing w:after="40" w:line="247" w:lineRule="auto"/>
+            </w:pPr>
+            <w:r>
+              <w:rPr>
+                <w:sz w:val="20"/>
+              </w:rPr>
+              <w:t>Lectura</w:t>
+            </w:r>
+          </w:p>
+        </w:tc>
+        <w:tc>
+          <w:tcPr>
+            <w:tcW w:w="7848" w:type="dxa"/>
+            <w:shd w:val="clear" w:color="auto" w:fill="FFFFFF"/>
+            <w:tcMar>
+              <w:top w:w="90" w:type="dxa"/>
+              <w:left w:w="90" w:type="dxa"/>
+              <w:bottom w:w="90" w:type="dxa"/>
+              <w:right w:w="90" w:type="dxa"/>
+            </w:tcMar>
+            <w:vAlign w:val="center"/>
+          </w:tcPr>
+          <w:p>
+            <w:pPr>
+              <w:spacing w:after="40" w:line="247" w:lineRule="auto"/>
+            </w:pPr>
+            <w:r>
+              <w:rPr>
+                <w:sz w:val="20"/>
+              </w:rPr>
+              <w:t>CSV separado por punto y coma, codificación latin-1</w:t>
+            </w:r>
+          </w:p>
+        </w:tc>
+      </w:tr>
+      <w:tr>
+        <w:trPr>
+          <w:cantSplit/>
+          <w:jc w:val="center"/>
+        </w:trPr>
+        <w:tc>
+          <w:tcPr>
+            <w:tcW w:w="2376" w:type="dxa"/>
+            <w:shd w:val="clear" w:color="auto" w:fill="FFFFFF"/>
+            <w:tcMar>
+              <w:top w:w="90" w:type="dxa"/>
+              <w:left w:w="90" w:type="dxa"/>
+              <w:bottom w:w="90" w:type="dxa"/>
+              <w:right w:w="90" w:type="dxa"/>
+            </w:tcMar>
+            <w:vAlign w:val="center"/>
+          </w:tcPr>
+          <w:p>
+            <w:pPr>
+              <w:spacing w:after="40" w:line="247" w:lineRule="auto"/>
+            </w:pPr>
+            <w:r>
+              <w:rPr>
+                <w:sz w:val="20"/>
+              </w:rPr>
+              <w:t>Sector observado</w:t>
+            </w:r>
+          </w:p>
+        </w:tc>
+        <w:tc>
+          <w:tcPr>
+            <w:tcW w:w="7848" w:type="dxa"/>
+            <w:shd w:val="clear" w:color="auto" w:fill="FFFFFF"/>
+            <w:tcMar>
+              <w:top w:w="90" w:type="dxa"/>
+              <w:left w:w="90" w:type="dxa"/>
+              <w:bottom w:w="90" w:type="dxa"/>
+              <w:right w:w="90" w:type="dxa"/>
+            </w:tcMar>
+            <w:vAlign w:val="center"/>
+          </w:tcPr>
+          <w:p>
+            <w:pPr>
+              <w:spacing w:after="40" w:line="247" w:lineRule="auto"/>
+            </w:pPr>
+            <w:r>
+              <w:rPr>
+                <w:sz w:val="20"/>
+              </w:rPr>
+              <w:t>SALUD</w:t>
+            </w:r>
+          </w:p>
+        </w:tc>
+      </w:tr>
+      <w:tr>
+        <w:trPr>
+          <w:cantSplit/>
+          <w:jc w:val="center"/>
+        </w:trPr>
+        <w:tc>
+          <w:tcPr>
+            <w:tcW w:w="2376" w:type="dxa"/>
+            <w:shd w:val="clear" w:color="auto" w:fill="FFFFFF"/>
+            <w:tcMar>
+              <w:top w:w="90" w:type="dxa"/>
+              <w:left w:w="90" w:type="dxa"/>
+              <w:bottom w:w="90" w:type="dxa"/>
+              <w:right w:w="90" w:type="dxa"/>
+            </w:tcMar>
+            <w:vAlign w:val="center"/>
+          </w:tcPr>
+          <w:p>
+            <w:pPr>
+              <w:spacing w:after="40" w:line="247" w:lineRule="auto"/>
+            </w:pPr>
+            <w:r>
+              <w:rPr>
+                <w:sz w:val="20"/>
+              </w:rPr>
+              <w:t>Fechas de publicación</w:t>
+            </w:r>
+          </w:p>
+        </w:tc>
+        <w:tc>
+          <w:tcPr>
+            <w:tcW w:w="7848" w:type="dxa"/>
+            <w:shd w:val="clear" w:color="auto" w:fill="FFFFFF"/>
+            <w:tcMar>
+              <w:top w:w="90" w:type="dxa"/>
+              <w:left w:w="90" w:type="dxa"/>
+              <w:bottom w:w="90" w:type="dxa"/>
+              <w:right w:w="90" w:type="dxa"/>
+            </w:tcMar>
+            <w:vAlign w:val="center"/>
+          </w:tcPr>
+          <w:p>
+            <w:pPr>
+              <w:spacing w:after="40" w:line="247" w:lineRule="auto"/>
+            </w:pPr>
+            <w:r>
+              <w:rPr>
+                <w:sz w:val="20"/>
+              </w:rPr>
+              <w:t>Del 15 de enero al 25 de marzo de 2026</w:t>
+            </w:r>
+          </w:p>
+        </w:tc>
+      </w:tr>
+      <w:tr>
+        <w:trPr>
+          <w:cantSplit/>
+          <w:jc w:val="center"/>
+        </w:trPr>
+        <w:tc>
+          <w:tcPr>
+            <w:tcW w:w="2376" w:type="dxa"/>
+            <w:shd w:val="clear" w:color="auto" w:fill="FFFFFF"/>
+            <w:tcMar>
+              <w:top w:w="90" w:type="dxa"/>
+              <w:left w:w="90" w:type="dxa"/>
+              <w:bottom w:w="90" w:type="dxa"/>
+              <w:right w:w="90" w:type="dxa"/>
+            </w:tcMar>
+            <w:vAlign w:val="center"/>
+          </w:tcPr>
+          <w:p>
+            <w:pPr>
+              <w:spacing w:after="40" w:line="247" w:lineRule="auto"/>
+            </w:pPr>
+            <w:r>
+              <w:rPr>
+                <w:sz w:val="20"/>
+              </w:rPr>
+              <w:t>Fechas de cierre</w:t>
+            </w:r>
+          </w:p>
+        </w:tc>
+        <w:tc>
+          <w:tcPr>
+            <w:tcW w:w="7848" w:type="dxa"/>
+            <w:shd w:val="clear" w:color="auto" w:fill="FFFFFF"/>
+            <w:tcMar>
+              <w:top w:w="90" w:type="dxa"/>
+              <w:left w:w="90" w:type="dxa"/>
+              <w:bottom w:w="90" w:type="dxa"/>
+              <w:right w:w="90" w:type="dxa"/>
+            </w:tcMar>
+            <w:vAlign w:val="center"/>
+          </w:tcPr>
+          <w:p>
+            <w:pPr>
+              <w:spacing w:after="40" w:line="247" w:lineRule="auto"/>
+            </w:pPr>
+            <w:r>
+              <w:rPr>
+                <w:sz w:val="20"/>
+              </w:rPr>
+              <w:t>Del 2 al 31 de marzo de 2026</w:t>
+            </w:r>
+          </w:p>
+        </w:tc>
+      </w:tr>
+    </w:tbl>
+    <w:p/>
+    <w:p>
+      <w:r>
+        <w:t>La cobertura se denomina reporte de marzo, porque no todas las licitaciones se publicaron ese mes. El criterio oficial de selección mensual aún requiere confirmación. La lectura latin-1 corresponde a esta copia: el archivo no supera una decodificación UTF-8 estricta.</w:t>
+      </w:r>
+    </w:p>
+    <w:p>
+      <w:pPr>
+        <w:pStyle w:val="Ttulo21"/>
+      </w:pPr>
+      <w:r>
+        <w:t>Variables principales</w:t>
+      </w:r>
+    </w:p>
+    <w:tbl>
+      <w:tblPr>
+        <w:tblW w:w="0" w:type="auto"/>
+        <w:jc w:val="center"/>
+        <w:tblBorders>
+          <w:top w:val="single" w:sz="4" w:space="0" w:color="D9D9D9"/>
+          <w:left w:val="single" w:sz="4" w:space="0" w:color="D9D9D9"/>
+          <w:bottom w:val="single" w:sz="4" w:space="0" w:color="D9D9D9"/>
+          <w:right w:val="single" w:sz="4" w:space="0" w:color="D9D9D9"/>
+          <w:insideH w:val="single" w:sz="4" w:space="0" w:color="D9D9D9"/>
+          <w:insideV w:val="single" w:sz="4" w:space="0" w:color="D9D9D9"/>
+        </w:tblBorders>
+        <w:tblLayout w:type="fixed"/>
+        <w:tblLook w:val="04A0" w:firstRow="1" w:lastRow="0" w:firstColumn="1" w:lastColumn="0" w:noHBand="0" w:noVBand="1"/>
+      </w:tblPr>
+      <w:tblGrid>
+        <w:gridCol w:w="3168"/>
+        <w:gridCol w:w="7056"/>
+      </w:tblGrid>
+      <w:tr>
+        <w:trPr>
+          <w:cantSplit/>
+          <w:tblHeader/>
+          <w:jc w:val="center"/>
+        </w:trPr>
+        <w:tc>
+          <w:tcPr>
+            <w:tcW w:w="3168" w:type="dxa"/>
+            <w:shd w:val="clear" w:color="auto" w:fill="E7EEF4"/>
+            <w:tcMar>
+              <w:top w:w="90" w:type="dxa"/>
+              <w:left w:w="90" w:type="dxa"/>
+              <w:bottom w:w="90" w:type="dxa"/>
+              <w:right w:w="90" w:type="dxa"/>
+            </w:tcMar>
+            <w:vAlign w:val="center"/>
+          </w:tcPr>
+          <w:p>
+            <w:pPr>
+              <w:spacing w:after="40" w:line="247" w:lineRule="auto"/>
+            </w:pPr>
+            <w:r>
+              <w:rPr>
+                <w:b/>
+                <w:sz w:val="20"/>
+              </w:rPr>
+              <w:t>Variable</w:t>
+            </w:r>
+          </w:p>
+        </w:tc>
+        <w:tc>
+          <w:tcPr>
+            <w:tcW w:w="7056" w:type="dxa"/>
+            <w:shd w:val="clear" w:color="auto" w:fill="E7EEF4"/>
+            <w:tcMar>
+              <w:top w:w="90" w:type="dxa"/>
+              <w:left w:w="90" w:type="dxa"/>
+              <w:bottom w:w="90" w:type="dxa"/>
+              <w:right w:w="90" w:type="dxa"/>
+            </w:tcMar>
+            <w:vAlign w:val="center"/>
+          </w:tcPr>
+          <w:p>
+            <w:pPr>
+              <w:spacing w:after="40" w:line="247" w:lineRule="auto"/>
+            </w:pPr>
+            <w:r>
+              <w:rPr>
+                <w:b/>
+                <w:sz w:val="20"/>
+              </w:rPr>
+              <w:t>Uso previsto</w:t>
+            </w:r>
+          </w:p>
+        </w:tc>
+      </w:tr>
+      <w:tr>
+        <w:trPr>
+          <w:cantSplit/>
+          <w:jc w:val="center"/>
+        </w:trPr>
+        <w:tc>
+          <w:tcPr>
+            <w:tcW w:w="3168" w:type="dxa"/>
+            <w:shd w:val="clear" w:color="auto" w:fill="FFFFFF"/>
+            <w:tcMar>
+              <w:top w:w="90" w:type="dxa"/>
+              <w:left w:w="90" w:type="dxa"/>
+              <w:bottom w:w="90" w:type="dxa"/>
+              <w:right w:w="90" w:type="dxa"/>
+            </w:tcMar>
+            <w:vAlign w:val="center"/>
+          </w:tcPr>
+          <w:p>
+            <w:pPr>
+              <w:spacing w:after="40" w:line="247" w:lineRule="auto"/>
+            </w:pPr>
+            <w:r>
+              <w:rPr>
+                <w:sz w:val="20"/>
+              </w:rPr>
+              <w:t>TipoLicitacion</w:t>
+            </w:r>
+          </w:p>
+        </w:tc>
+        <w:tc>
+          <w:tcPr>
+            <w:tcW w:w="7056" w:type="dxa"/>
+            <w:shd w:val="clear" w:color="auto" w:fill="FFFFFF"/>
+            <w:tcMar>
+              <w:top w:w="90" w:type="dxa"/>
+              <w:left w:w="90" w:type="dxa"/>
+              <w:bottom w:w="90" w:type="dxa"/>
+              <w:right w:w="90" w:type="dxa"/>
+            </w:tcMar>
+            <w:vAlign w:val="center"/>
+          </w:tcPr>
+          <w:p>
+            <w:pPr>
+              <w:spacing w:after="40" w:line="247" w:lineRule="auto"/>
+            </w:pPr>
+            <w:r>
+              <w:rPr>
+                <w:sz w:val="20"/>
+              </w:rPr>
+              <w:t>Comparar categorías de licitación.</w:t>
+            </w:r>
+          </w:p>
+        </w:tc>
+      </w:tr>
+      <w:tr>
+        <w:trPr>
+          <w:cantSplit/>
+          <w:jc w:val="center"/>
+        </w:trPr>
+        <w:tc>
+          <w:tcPr>
+            <w:tcW w:w="3168" w:type="dxa"/>
+            <w:shd w:val="clear" w:color="auto" w:fill="FFFFFF"/>
+            <w:tcMar>
+              <w:top w:w="90" w:type="dxa"/>
+              <w:left w:w="90" w:type="dxa"/>
+              <w:bottom w:w="90" w:type="dxa"/>
+              <w:right w:w="90" w:type="dxa"/>
+            </w:tcMar>
+            <w:vAlign w:val="center"/>
+          </w:tcPr>
+          <w:p>
+            <w:pPr>
+              <w:spacing w:after="40" w:line="247" w:lineRule="auto"/>
+            </w:pPr>
+            <w:r>
+              <w:rPr>
+                <w:sz w:val="20"/>
+              </w:rPr>
+              <w:t>TamanoProveedor</w:t>
+            </w:r>
+          </w:p>
+        </w:tc>
+        <w:tc>
+          <w:tcPr>
+            <w:tcW w:w="7056" w:type="dxa"/>
+            <w:shd w:val="clear" w:color="auto" w:fill="FFFFFF"/>
+            <w:tcMar>
+              <w:top w:w="90" w:type="dxa"/>
+              <w:left w:w="90" w:type="dxa"/>
+              <w:bottom w:w="90" w:type="dxa"/>
+              <w:right w:w="90" w:type="dxa"/>
+            </w:tcMar>
+            <w:vAlign w:val="center"/>
+          </w:tcPr>
+          <w:p>
+            <w:pPr>
+              <w:spacing w:after="40" w:line="247" w:lineRule="auto"/>
+            </w:pPr>
+            <w:r>
+              <w:rPr>
+                <w:sz w:val="20"/>
+              </w:rPr>
+              <w:t>Comparar tamaños registrados; mantener NoClasificado separado.</w:t>
+            </w:r>
+          </w:p>
+        </w:tc>
+      </w:tr>
+      <w:tr>
+        <w:trPr>
+          <w:cantSplit/>
+          <w:jc w:val="center"/>
+        </w:trPr>
+        <w:tc>
+          <w:tcPr>
+            <w:tcW w:w="3168" w:type="dxa"/>
+            <w:shd w:val="clear" w:color="auto" w:fill="FFFFFF"/>
+            <w:tcMar>
+              <w:top w:w="90" w:type="dxa"/>
+              <w:left w:w="90" w:type="dxa"/>
+              <w:bottom w:w="90" w:type="dxa"/>
+              <w:right w:w="90" w:type="dxa"/>
+            </w:tcMar>
+            <w:vAlign w:val="center"/>
+          </w:tcPr>
+          <w:p>
+            <w:pPr>
+              <w:spacing w:after="40" w:line="247" w:lineRule="auto"/>
+            </w:pPr>
+            <w:r>
+              <w:rPr>
+                <w:sz w:val="20"/>
+              </w:rPr>
+              <w:t>ResultadoOferta</w:t>
+            </w:r>
+          </w:p>
+        </w:tc>
+        <w:tc>
+          <w:tcPr>
+            <w:tcW w:w="7056" w:type="dxa"/>
+            <w:shd w:val="clear" w:color="auto" w:fill="FFFFFF"/>
+            <w:tcMar>
+              <w:top w:w="90" w:type="dxa"/>
+              <w:left w:w="90" w:type="dxa"/>
+              <w:bottom w:w="90" w:type="dxa"/>
+              <w:right w:w="90" w:type="dxa"/>
+            </w:tcMar>
+            <w:vAlign w:val="center"/>
+          </w:tcPr>
+          <w:p>
+            <w:pPr>
+              <w:spacing w:after="40" w:line="247" w:lineRule="auto"/>
+            </w:pPr>
+            <w:r>
+              <w:rPr>
+                <w:sz w:val="20"/>
+              </w:rPr>
+              <w:t>Identificar Ganadora o Perdedora, considerando el estado del proceso.</w:t>
+            </w:r>
+          </w:p>
+        </w:tc>
+      </w:tr>
+      <w:tr>
+        <w:trPr>
+          <w:cantSplit/>
+          <w:jc w:val="center"/>
+        </w:trPr>
+        <w:tc>
+          <w:tcPr>
+            <w:tcW w:w="3168" w:type="dxa"/>
+            <w:shd w:val="clear" w:color="auto" w:fill="FFFFFF"/>
+            <w:tcMar>
+              <w:top w:w="90" w:type="dxa"/>
+              <w:left w:w="90" w:type="dxa"/>
+              <w:bottom w:w="90" w:type="dxa"/>
+              <w:right w:w="90" w:type="dxa"/>
+            </w:tcMar>
+            <w:vAlign w:val="center"/>
+          </w:tcPr>
+          <w:p>
+            <w:pPr>
+              <w:spacing w:after="40" w:line="247" w:lineRule="auto"/>
+            </w:pPr>
+            <w:r>
+              <w:rPr>
+                <w:sz w:val="20"/>
+              </w:rPr>
+              <w:t>EstadoLicitacion</w:t>
+            </w:r>
+          </w:p>
+        </w:tc>
+        <w:tc>
+          <w:tcPr>
+            <w:tcW w:w="7056" w:type="dxa"/>
+            <w:shd w:val="clear" w:color="auto" w:fill="FFFFFF"/>
+            <w:tcMar>
+              <w:top w:w="90" w:type="dxa"/>
+              <w:left w:w="90" w:type="dxa"/>
+              <w:bottom w:w="90" w:type="dxa"/>
+              <w:right w:w="90" w:type="dxa"/>
+            </w:tcMar>
+            <w:vAlign w:val="center"/>
+          </w:tcPr>
+          <w:p>
+            <w:pPr>
+              <w:spacing w:after="40" w:line="247" w:lineRule="auto"/>
+            </w:pPr>
+            <w:r>
+              <w:rPr>
+                <w:sz w:val="20"/>
+              </w:rPr>
+              <w:t>Distinguir procesos adjudicados, cerrados, desiertos o revocados.</w:t>
+            </w:r>
+          </w:p>
+        </w:tc>
+      </w:tr>
+      <w:tr>
+        <w:trPr>
+          <w:cantSplit/>
+          <w:jc w:val="center"/>
+        </w:trPr>
+        <w:tc>
+          <w:tcPr>
+            <w:tcW w:w="3168" w:type="dxa"/>
+            <w:shd w:val="clear" w:color="auto" w:fill="FFFFFF"/>
+            <w:tcMar>
+              <w:top w:w="90" w:type="dxa"/>
+              <w:left w:w="90" w:type="dxa"/>
+              <w:bottom w:w="90" w:type="dxa"/>
+              <w:right w:w="90" w:type="dxa"/>
+            </w:tcMar>
+            <w:vAlign w:val="center"/>
+          </w:tcPr>
+          <w:p>
+            <w:pPr>
+              <w:spacing w:after="40" w:line="247" w:lineRule="auto"/>
+            </w:pPr>
+            <w:r>
+              <w:rPr>
+                <w:sz w:val="20"/>
+              </w:rPr>
+              <w:t>NroLicitacion y ProveedorRUT</w:t>
+            </w:r>
+          </w:p>
+        </w:tc>
+        <w:tc>
+          <w:tcPr>
+            <w:tcW w:w="7056" w:type="dxa"/>
+            <w:shd w:val="clear" w:color="auto" w:fill="FFFFFF"/>
+            <w:tcMar>
+              <w:top w:w="90" w:type="dxa"/>
+              <w:left w:w="90" w:type="dxa"/>
+              <w:bottom w:w="90" w:type="dxa"/>
+              <w:right w:w="90" w:type="dxa"/>
+            </w:tcMar>
+            <w:vAlign w:val="center"/>
+          </w:tcPr>
+          <w:p>
+            <w:pPr>
+              <w:spacing w:after="40" w:line="247" w:lineRule="auto"/>
+            </w:pPr>
+            <w:r>
+              <w:rPr>
+                <w:sz w:val="20"/>
+              </w:rPr>
+              <w:t>Controlar relaciones y repeticiones entre procesos y proveedores.</w:t>
+            </w:r>
+          </w:p>
+        </w:tc>
+      </w:tr>
+    </w:tbl>
+    <w:p/>
+    <w:p>
+      <w:r>
+        <w:t>El diccionario del repositorio documenta las 74 columnas, sus tipos observados, roles propuestos, faltantes y observaciones. Las definiciones se contrastaron parcialmente con ChileCompra. La documentación de la API describe otro esquema, por lo que no confirma por sí sola todas las correspondencias del CSV (ChileCompra, s. f.-b).</w:t>
+      </w:r>
+    </w:p>
+    <w:p>
+      <w:pPr>
+        <w:pStyle w:val="Ttulo21"/>
+      </w:pPr>
+      <w:r>
+        <w:t>Supuestos y restricciones</w:t>
+      </w:r>
+    </w:p>
+    <w:p>
+      <w:r>
+        <w:t xml:space="preserve">El análisis será descriptivo y no establecerá causalidad. La proporción prevista divide ofertas ganadoras por ofertas con resultado válido en cada grupo, e informa el denominador. Un grupo sin resultados válidos no tendrá proporción. Se revisará el estado de la licitación antes de considerar definitivas las etiquetas de resultado. Tampoco </w:t>
+      </w:r>
+      <w:r>
+        <w:lastRenderedPageBreak/>
+        <w:t>se generalizará a otros meses ni se interpretarán montos ofertados como pagos realizados.</w:t>
+      </w:r>
+    </w:p>
+    <w:p>
+      <w:r>
+        <w:br w:type="page"/>
+      </w:r>
+    </w:p>
+    <w:p>
+      <w:pPr>
+        <w:pStyle w:val="Ttulo11"/>
+      </w:pPr>
+      <w:bookmarkStart w:id="2" w:name="_Toc240146701"/>
+      <w:r>
+        <w:lastRenderedPageBreak/>
+        <w:t>Herramientas y entorno reproducible</w:t>
+      </w:r>
+      <w:bookmarkEnd w:id="2"/>
+    </w:p>
+    <w:p>
+      <w:r>
+        <w:t>Jupyter reúne explicaciones, código y salidas en el notebook F1_Definición.ipynb. pandas realiza la lectura tabular con parámetros explícitos, mientras que NumPy se utiliza en una comprobación sintética de integración. La documentación de read_csv permite precisar separador y codificación (The pandas development team, s. f.); arange genera la secuencia de enteros de la prueba inicial (NumPy Developers, s. f.).</w:t>
+      </w:r>
+    </w:p>
+    <w:p>
+      <w:r>
+        <w:t>Las funciones reutilizables se ubican en src/proyecto.py. versiones_entorno consulta las dependencias instaladas; sha256_archivo calcula la huella por bloques; leer_datos_f1 lee el CSV y detecta archivos ausentes, columnas requeridas faltantes y conjuntos sin registros. Se separaron estas operaciones para que el notebook conserve un flujo legible y pueda reutilizarse el código.</w:t>
+      </w:r>
+    </w:p>
+    <w:p>
+      <w:pPr>
+        <w:pStyle w:val="Ttulo21"/>
+      </w:pPr>
+      <w:r>
+        <w:t>Configuración y ejecución</w:t>
+      </w:r>
+    </w:p>
+    <w:p>
+      <w:r>
+        <w:t>La ejecución verificada se realizó en Windows con Python 3.12.14 y un ambiente virtual .venv. requirements.txt declara las dependencias principales y las salidas de F1 registran sus versiones. La referencia previa a Python 3.14.7 no forma parte de esta comprobación. Cada integrante debe ejecutar el notebook completo en su propio entorno.</w:t>
+      </w:r>
+    </w:p>
+    <w:p>
+      <w:pPr>
+        <w:spacing w:after="60"/>
+      </w:pPr>
       <w:r>
         <w:rPr>
-          <w:b/>
-          <w:bCs/>
-          <w:color w:val="000000" w:themeColor="text1"/>
-          <w:sz w:val="72"/>
-          <w:szCs w:val="72"/>
-          <w:lang w:val="es-CL"/>
+          <w:rFonts w:ascii="Consolas" w:hAnsi="Consolas"/>
+          <w:sz w:val="18"/>
         </w:rPr>
-        <w:t> </w:t>
-      </w:r>
-    </w:p>
-    <w:p>
-      <w:pPr>
-        <w:pBdr>
-          <w:top w:val="nil"/>
-          <w:left w:val="nil"/>
-          <w:bottom w:val="nil"/>
-          <w:right w:val="nil"/>
-          <w:between w:val="nil"/>
-        </w:pBdr>
-        <w:spacing w:before="210"/>
+        <w:t>py -3.12 -m venv .venv</w:t>
+      </w:r>
+    </w:p>
+    <w:p>
+      <w:pPr>
+        <w:spacing w:after="60"/>
+      </w:pPr>
+      <w:r>
         <w:rPr>
-          <w:b/>
-          <w:bCs/>
-          <w:color w:val="000000" w:themeColor="text1"/>
-          <w:sz w:val="72"/>
-          <w:szCs w:val="72"/>
-          <w:lang w:eastAsia="es-ES" w:bidi="es-ES"/>
+          <w:rFonts w:ascii="Consolas" w:hAnsi="Consolas"/>
+          <w:sz w:val="18"/>
         </w:rPr>
+        <w:t>.\.venv\Scripts\python.exe -m pip install -r requirements.txt</w:t>
+      </w:r>
+    </w:p>
+    <w:p>
+      <w:pPr>
+        <w:spacing w:after="60"/>
       </w:pPr>
       <w:r>
         <w:rPr>
-          <w:b/>
-          <w:bCs/>
-          <w:color w:val="000000" w:themeColor="text1"/>
-          <w:sz w:val="72"/>
-          <w:szCs w:val="72"/>
-          <w:lang w:eastAsia="es-ES" w:bidi="es-ES"/>
+          <w:rFonts w:ascii="Consolas" w:hAnsi="Consolas"/>
+          <w:sz w:val="18"/>
         </w:rPr>
-        <w:t>PROGRAMACIÓN PARA LA CIENCIA DE DATOS</w:t>
-      </w:r>
-    </w:p>
-    <w:p>
-      <w:pPr>
-        <w:pBdr>
-          <w:top w:val="nil"/>
-          <w:left w:val="nil"/>
-          <w:bottom w:val="nil"/>
-          <w:right w:val="nil"/>
-          <w:between w:val="nil"/>
-        </w:pBdr>
-        <w:spacing w:before="210"/>
+        <w:t>.\.venv\Scripts\python.exe -m jupyterlab</w:t>
+      </w:r>
+    </w:p>
+    <w:p>
+      <w:r>
+        <w:t>Desde Jupyter se selecciona el kernel del entorno y se reinicia antes de ejecutar todas las celdas. Como alternativa, F1/verificar_f1.py inicia un kernel nuevo con el intérprete utilizado, ejecuta el notebook y guarda las salidas y el registro F1_ejecucion.json.</w:t>
+      </w:r>
+    </w:p>
+    <w:p>
+      <w:pPr>
+        <w:pStyle w:val="Ttulo21"/>
+      </w:pPr>
+      <w:r>
+        <w:t>Alcance de la reproducibilidad</w:t>
+      </w:r>
+    </w:p>
+    <w:p>
+      <w:r>
+        <w:t>Samuel y Mietchen (2024) muestran que documentar dependencias y comprobar la ejecución son aspectos centrales para reproducir notebooks. En este proyecto se conserva el archivo de entrada y se verifican sus dimensiones y su huella antes de continuar. Esto permite detectar cambios de versión del dataset y fallas del entorno.</w:t>
+      </w:r>
+    </w:p>
+    <w:p>
+      <w:r>
+        <w:t>La comprobación disponible corresponde a F1 en el entorno indicado. No demuestra todavía que F2 funcione, que las definiciones de todas las variables estén resueltas o que el análisis sea reproducible en cualquier equipo. Esas verificaciones deberán ampliarse cuando se implemente el procesamiento.</w:t>
+      </w:r>
+    </w:p>
+    <w:p>
+      <w:r>
+        <w:br w:type="page"/>
+      </w:r>
+    </w:p>
+    <w:p>
+      <w:pPr>
+        <w:pStyle w:val="Ttulo11"/>
+      </w:pPr>
+      <w:bookmarkStart w:id="3" w:name="_Toc240146702"/>
+      <w:r>
+        <w:lastRenderedPageBreak/>
+        <w:t>Validación técnica y resultados de F1</w:t>
+      </w:r>
+      <w:bookmarkEnd w:id="3"/>
+    </w:p>
+    <w:p>
+      <w:r>
+        <w:t>El notebook se ejecutó de inicio a fin en un kernel nuevo. El registro de evidencia informa cuatro celdas de código y cero errores. La lectura confirmó 44.226 filas, 74 columnas y la presencia del esquema mínimo requerido. La huella del CSV se comprobó antes y después de las pruebas, sin cambios.</w:t>
+      </w:r>
+    </w:p>
+    <w:tbl>
+      <w:tblPr>
+        <w:tblW w:w="0" w:type="auto"/>
+        <w:jc w:val="center"/>
+        <w:tblBorders>
+          <w:top w:val="single" w:sz="4" w:space="0" w:color="D9D9D9"/>
+          <w:left w:val="single" w:sz="4" w:space="0" w:color="D9D9D9"/>
+          <w:bottom w:val="single" w:sz="4" w:space="0" w:color="D9D9D9"/>
+          <w:right w:val="single" w:sz="4" w:space="0" w:color="D9D9D9"/>
+          <w:insideH w:val="single" w:sz="4" w:space="0" w:color="D9D9D9"/>
+          <w:insideV w:val="single" w:sz="4" w:space="0" w:color="D9D9D9"/>
+        </w:tblBorders>
+        <w:tblLayout w:type="fixed"/>
+        <w:tblLook w:val="04A0" w:firstRow="1" w:lastRow="0" w:firstColumn="1" w:lastColumn="0" w:noHBand="0" w:noVBand="1"/>
+      </w:tblPr>
+      <w:tblGrid>
+        <w:gridCol w:w="2232"/>
+        <w:gridCol w:w="6696"/>
+        <w:gridCol w:w="1296"/>
+      </w:tblGrid>
+      <w:tr>
+        <w:trPr>
+          <w:cantSplit/>
+          <w:tblHeader/>
+          <w:jc w:val="center"/>
+        </w:trPr>
+        <w:tc>
+          <w:tcPr>
+            <w:tcW w:w="2232" w:type="dxa"/>
+            <w:shd w:val="clear" w:color="auto" w:fill="E7EEF4"/>
+            <w:tcMar>
+              <w:top w:w="90" w:type="dxa"/>
+              <w:left w:w="90" w:type="dxa"/>
+              <w:bottom w:w="90" w:type="dxa"/>
+              <w:right w:w="90" w:type="dxa"/>
+            </w:tcMar>
+            <w:vAlign w:val="center"/>
+          </w:tcPr>
+          <w:p>
+            <w:pPr>
+              <w:spacing w:after="40" w:line="247" w:lineRule="auto"/>
+            </w:pPr>
+            <w:r>
+              <w:rPr>
+                <w:b/>
+                <w:sz w:val="20"/>
+              </w:rPr>
+              <w:t>Prueba</w:t>
+            </w:r>
+          </w:p>
+        </w:tc>
+        <w:tc>
+          <w:tcPr>
+            <w:tcW w:w="6696" w:type="dxa"/>
+            <w:shd w:val="clear" w:color="auto" w:fill="E7EEF4"/>
+            <w:tcMar>
+              <w:top w:w="90" w:type="dxa"/>
+              <w:left w:w="90" w:type="dxa"/>
+              <w:bottom w:w="90" w:type="dxa"/>
+              <w:right w:w="90" w:type="dxa"/>
+            </w:tcMar>
+            <w:vAlign w:val="center"/>
+          </w:tcPr>
+          <w:p>
+            <w:pPr>
+              <w:spacing w:after="40" w:line="247" w:lineRule="auto"/>
+            </w:pPr>
+            <w:r>
+              <w:rPr>
+                <w:b/>
+                <w:sz w:val="20"/>
+              </w:rPr>
+              <w:t>Resultado esperado</w:t>
+            </w:r>
+          </w:p>
+        </w:tc>
+        <w:tc>
+          <w:tcPr>
+            <w:tcW w:w="1296" w:type="dxa"/>
+            <w:shd w:val="clear" w:color="auto" w:fill="E7EEF4"/>
+            <w:tcMar>
+              <w:top w:w="90" w:type="dxa"/>
+              <w:left w:w="90" w:type="dxa"/>
+              <w:bottom w:w="90" w:type="dxa"/>
+              <w:right w:w="90" w:type="dxa"/>
+            </w:tcMar>
+            <w:vAlign w:val="center"/>
+          </w:tcPr>
+          <w:p>
+            <w:pPr>
+              <w:spacing w:after="40" w:line="247" w:lineRule="auto"/>
+            </w:pPr>
+            <w:r>
+              <w:rPr>
+                <w:b/>
+                <w:sz w:val="20"/>
+              </w:rPr>
+              <w:t>Resultado</w:t>
+            </w:r>
+          </w:p>
+        </w:tc>
+      </w:tr>
+      <w:tr>
+        <w:trPr>
+          <w:cantSplit/>
+          <w:jc w:val="center"/>
+        </w:trPr>
+        <w:tc>
+          <w:tcPr>
+            <w:tcW w:w="2232" w:type="dxa"/>
+            <w:shd w:val="clear" w:color="auto" w:fill="FFFFFF"/>
+            <w:tcMar>
+              <w:top w:w="90" w:type="dxa"/>
+              <w:left w:w="90" w:type="dxa"/>
+              <w:bottom w:w="90" w:type="dxa"/>
+              <w:right w:w="90" w:type="dxa"/>
+            </w:tcMar>
+            <w:vAlign w:val="center"/>
+          </w:tcPr>
+          <w:p>
+            <w:pPr>
+              <w:spacing w:after="40" w:line="247" w:lineRule="auto"/>
+            </w:pPr>
+            <w:r>
+              <w:rPr>
+                <w:sz w:val="20"/>
+              </w:rPr>
+              <w:t>Lectura normal</w:t>
+            </w:r>
+          </w:p>
+        </w:tc>
+        <w:tc>
+          <w:tcPr>
+            <w:tcW w:w="6696" w:type="dxa"/>
+            <w:shd w:val="clear" w:color="auto" w:fill="FFFFFF"/>
+            <w:tcMar>
+              <w:top w:w="90" w:type="dxa"/>
+              <w:left w:w="90" w:type="dxa"/>
+              <w:bottom w:w="90" w:type="dxa"/>
+              <w:right w:w="90" w:type="dxa"/>
+            </w:tcMar>
+            <w:vAlign w:val="center"/>
+          </w:tcPr>
+          <w:p>
+            <w:pPr>
+              <w:spacing w:after="40" w:line="247" w:lineRule="auto"/>
+            </w:pPr>
+            <w:r>
+              <w:rPr>
+                <w:sz w:val="20"/>
+              </w:rPr>
+              <w:t>Cargar una fila de prueba y conservar su resultado.</w:t>
+            </w:r>
+          </w:p>
+        </w:tc>
+        <w:tc>
+          <w:tcPr>
+            <w:tcW w:w="1296" w:type="dxa"/>
+            <w:shd w:val="clear" w:color="auto" w:fill="FFFFFF"/>
+            <w:tcMar>
+              <w:top w:w="90" w:type="dxa"/>
+              <w:left w:w="90" w:type="dxa"/>
+              <w:bottom w:w="90" w:type="dxa"/>
+              <w:right w:w="90" w:type="dxa"/>
+            </w:tcMar>
+            <w:vAlign w:val="center"/>
+          </w:tcPr>
+          <w:p>
+            <w:pPr>
+              <w:spacing w:after="40" w:line="247" w:lineRule="auto"/>
+            </w:pPr>
+            <w:r>
+              <w:rPr>
+                <w:sz w:val="20"/>
+              </w:rPr>
+              <w:t>OK</w:t>
+            </w:r>
+          </w:p>
+        </w:tc>
+      </w:tr>
+      <w:tr>
+        <w:trPr>
+          <w:cantSplit/>
+          <w:jc w:val="center"/>
+        </w:trPr>
+        <w:tc>
+          <w:tcPr>
+            <w:tcW w:w="2232" w:type="dxa"/>
+            <w:shd w:val="clear" w:color="auto" w:fill="FFFFFF"/>
+            <w:tcMar>
+              <w:top w:w="90" w:type="dxa"/>
+              <w:left w:w="90" w:type="dxa"/>
+              <w:bottom w:w="90" w:type="dxa"/>
+              <w:right w:w="90" w:type="dxa"/>
+            </w:tcMar>
+            <w:vAlign w:val="center"/>
+          </w:tcPr>
+          <w:p>
+            <w:pPr>
+              <w:spacing w:after="40" w:line="247" w:lineRule="auto"/>
+            </w:pPr>
+            <w:r>
+              <w:rPr>
+                <w:sz w:val="20"/>
+              </w:rPr>
+              <w:t>Archivo ausente</w:t>
+            </w:r>
+          </w:p>
+        </w:tc>
+        <w:tc>
+          <w:tcPr>
+            <w:tcW w:w="6696" w:type="dxa"/>
+            <w:shd w:val="clear" w:color="auto" w:fill="FFFFFF"/>
+            <w:tcMar>
+              <w:top w:w="90" w:type="dxa"/>
+              <w:left w:w="90" w:type="dxa"/>
+              <w:bottom w:w="90" w:type="dxa"/>
+              <w:right w:w="90" w:type="dxa"/>
+            </w:tcMar>
+            <w:vAlign w:val="center"/>
+          </w:tcPr>
+          <w:p>
+            <w:pPr>
+              <w:spacing w:after="40" w:line="247" w:lineRule="auto"/>
+            </w:pPr>
+            <w:r>
+              <w:rPr>
+                <w:sz w:val="20"/>
+              </w:rPr>
+              <w:t>Detectar que la ruta no contiene el archivo.</w:t>
+            </w:r>
+          </w:p>
+        </w:tc>
+        <w:tc>
+          <w:tcPr>
+            <w:tcW w:w="1296" w:type="dxa"/>
+            <w:shd w:val="clear" w:color="auto" w:fill="FFFFFF"/>
+            <w:tcMar>
+              <w:top w:w="90" w:type="dxa"/>
+              <w:left w:w="90" w:type="dxa"/>
+              <w:bottom w:w="90" w:type="dxa"/>
+              <w:right w:w="90" w:type="dxa"/>
+            </w:tcMar>
+            <w:vAlign w:val="center"/>
+          </w:tcPr>
+          <w:p>
+            <w:pPr>
+              <w:spacing w:after="40" w:line="247" w:lineRule="auto"/>
+            </w:pPr>
+            <w:r>
+              <w:rPr>
+                <w:sz w:val="20"/>
+              </w:rPr>
+              <w:t>OK</w:t>
+            </w:r>
+          </w:p>
+        </w:tc>
+      </w:tr>
+      <w:tr>
+        <w:trPr>
+          <w:cantSplit/>
+          <w:jc w:val="center"/>
+        </w:trPr>
+        <w:tc>
+          <w:tcPr>
+            <w:tcW w:w="2232" w:type="dxa"/>
+            <w:shd w:val="clear" w:color="auto" w:fill="FFFFFF"/>
+            <w:tcMar>
+              <w:top w:w="90" w:type="dxa"/>
+              <w:left w:w="90" w:type="dxa"/>
+              <w:bottom w:w="90" w:type="dxa"/>
+              <w:right w:w="90" w:type="dxa"/>
+            </w:tcMar>
+            <w:vAlign w:val="center"/>
+          </w:tcPr>
+          <w:p>
+            <w:pPr>
+              <w:spacing w:after="40" w:line="247" w:lineRule="auto"/>
+            </w:pPr>
+            <w:r>
+              <w:rPr>
+                <w:sz w:val="20"/>
+              </w:rPr>
+              <w:t>Columna ausente</w:t>
+            </w:r>
+          </w:p>
+        </w:tc>
+        <w:tc>
+          <w:tcPr>
+            <w:tcW w:w="6696" w:type="dxa"/>
+            <w:shd w:val="clear" w:color="auto" w:fill="FFFFFF"/>
+            <w:tcMar>
+              <w:top w:w="90" w:type="dxa"/>
+              <w:left w:w="90" w:type="dxa"/>
+              <w:bottom w:w="90" w:type="dxa"/>
+              <w:right w:w="90" w:type="dxa"/>
+            </w:tcMar>
+            <w:vAlign w:val="center"/>
+          </w:tcPr>
+          <w:p>
+            <w:pPr>
+              <w:spacing w:after="40" w:line="247" w:lineRule="auto"/>
+            </w:pPr>
+            <w:r>
+              <w:rPr>
+                <w:sz w:val="20"/>
+              </w:rPr>
+              <w:t>Detectar que falta TamanoProveedor.</w:t>
+            </w:r>
+          </w:p>
+        </w:tc>
+        <w:tc>
+          <w:tcPr>
+            <w:tcW w:w="1296" w:type="dxa"/>
+            <w:shd w:val="clear" w:color="auto" w:fill="FFFFFF"/>
+            <w:tcMar>
+              <w:top w:w="90" w:type="dxa"/>
+              <w:left w:w="90" w:type="dxa"/>
+              <w:bottom w:w="90" w:type="dxa"/>
+              <w:right w:w="90" w:type="dxa"/>
+            </w:tcMar>
+            <w:vAlign w:val="center"/>
+          </w:tcPr>
+          <w:p>
+            <w:pPr>
+              <w:spacing w:after="40" w:line="247" w:lineRule="auto"/>
+            </w:pPr>
+            <w:r>
+              <w:rPr>
+                <w:sz w:val="20"/>
+              </w:rPr>
+              <w:t>OK</w:t>
+            </w:r>
+          </w:p>
+        </w:tc>
+      </w:tr>
+      <w:tr>
+        <w:trPr>
+          <w:cantSplit/>
+          <w:jc w:val="center"/>
+        </w:trPr>
+        <w:tc>
+          <w:tcPr>
+            <w:tcW w:w="2232" w:type="dxa"/>
+            <w:shd w:val="clear" w:color="auto" w:fill="FFFFFF"/>
+            <w:tcMar>
+              <w:top w:w="90" w:type="dxa"/>
+              <w:left w:w="90" w:type="dxa"/>
+              <w:bottom w:w="90" w:type="dxa"/>
+              <w:right w:w="90" w:type="dxa"/>
+            </w:tcMar>
+            <w:vAlign w:val="center"/>
+          </w:tcPr>
+          <w:p>
+            <w:pPr>
+              <w:spacing w:after="40" w:line="247" w:lineRule="auto"/>
+            </w:pPr>
+            <w:r>
+              <w:rPr>
+                <w:sz w:val="20"/>
+              </w:rPr>
+              <w:t>Archivo sin registros</w:t>
+            </w:r>
+          </w:p>
+        </w:tc>
+        <w:tc>
+          <w:tcPr>
+            <w:tcW w:w="6696" w:type="dxa"/>
+            <w:shd w:val="clear" w:color="auto" w:fill="FFFFFF"/>
+            <w:tcMar>
+              <w:top w:w="90" w:type="dxa"/>
+              <w:left w:w="90" w:type="dxa"/>
+              <w:bottom w:w="90" w:type="dxa"/>
+              <w:right w:w="90" w:type="dxa"/>
+            </w:tcMar>
+            <w:vAlign w:val="center"/>
+          </w:tcPr>
+          <w:p>
+            <w:pPr>
+              <w:spacing w:after="40" w:line="247" w:lineRule="auto"/>
+            </w:pPr>
+            <w:r>
+              <w:rPr>
+                <w:sz w:val="20"/>
+              </w:rPr>
+              <w:t>Rechazar un encabezado sin filas de datos.</w:t>
+            </w:r>
+          </w:p>
+        </w:tc>
+        <w:tc>
+          <w:tcPr>
+            <w:tcW w:w="1296" w:type="dxa"/>
+            <w:shd w:val="clear" w:color="auto" w:fill="FFFFFF"/>
+            <w:tcMar>
+              <w:top w:w="90" w:type="dxa"/>
+              <w:left w:w="90" w:type="dxa"/>
+              <w:bottom w:w="90" w:type="dxa"/>
+              <w:right w:w="90" w:type="dxa"/>
+            </w:tcMar>
+            <w:vAlign w:val="center"/>
+          </w:tcPr>
+          <w:p>
+            <w:pPr>
+              <w:spacing w:after="40" w:line="247" w:lineRule="auto"/>
+            </w:pPr>
+            <w:r>
+              <w:rPr>
+                <w:sz w:val="20"/>
+              </w:rPr>
+              <w:t>OK</w:t>
+            </w:r>
+          </w:p>
+        </w:tc>
+      </w:tr>
+    </w:tbl>
+    <w:p/>
+    <w:p>
+      <w:r>
+        <w:t>Las pruebas usan archivos temporales pequeños. Los mensajes de excepción son resultados esperados que permiten verificar el contrato de lectura; no indican que el CSV original tenga esos errores. Estas comprobaciones cubren el código inicial, no el futuro pipeline de limpieza.</w:t>
+      </w:r>
+    </w:p>
+    <w:p>
+      <w:pPr>
+        <w:pStyle w:val="Ttulo21"/>
+      </w:pPr>
+      <w:r>
+        <w:t>Observaciones que orientan F2</w:t>
+      </w:r>
+    </w:p>
+    <w:p>
+      <w:r>
+        <w:t>El diccionario registra tres columnas completamente vacías y 3.410 ofertas con tamaño NoClasificado. Los 7.613 valores presentes de FechaEstimadaEvaluacionOfertas corresponden al año 1900; no se utilizarán como fechas operativas hasta aclarar su significado. En todas las filas, monto neto por cantidad coincide con el monto total dentro de la tolerancia de comprobación, pero esta relación no confirma el tratamiento de impuestos.</w:t>
+      </w:r>
+    </w:p>
+    <w:p>
+      <w:r>
+        <w:t>También se observaron ofertas asociadas a procesos cerrados, desiertos y revocados. ChileCompra (s. f.-c) distingue estos estados de una licitación adjudicada. F2 deberá contrastarlos con ResultadoOferta antes de construir una comparación de resultados definitivos. Estas observaciones orientan decisiones pendientes; el archivo original todavía no ha sido limpiado.</w:t>
+      </w:r>
+    </w:p>
+    <w:p>
+      <w:pPr>
+        <w:pStyle w:val="Ttulo21"/>
+      </w:pPr>
+      <w:r>
+        <w:t>Evidencias disponibles</w:t>
+      </w:r>
+    </w:p>
+    <w:p>
+      <w:r>
+        <w:t>Las salidas permanecen en F1_Definición.ipynb. evidencias/F1_ejecucion.json registra la ejecución del 13 de septiembre de 2026 a las 01:40 UTC, equivalente al 12 de septiembre a las 22:40 en Santiago. El diccionario y data/README.md documentan la versión del CSV. Al cambiar el código o el notebook se debe renovar la evidencia.</w:t>
+      </w:r>
+    </w:p>
+    <w:p>
+      <w:r>
+        <w:br w:type="page"/>
+      </w:r>
+    </w:p>
+    <w:p>
+      <w:pPr>
+        <w:pStyle w:val="Ttulo11"/>
+      </w:pPr>
+      <w:bookmarkStart w:id="4" w:name="_Toc240146703"/>
+      <w:r>
+        <w:lastRenderedPageBreak/>
+        <w:t>Control de versiones y documentación</w:t>
+      </w:r>
+      <w:bookmarkEnd w:id="4"/>
+    </w:p>
+    <w:p>
+      <w:r>
+        <w:t>El repositorio organiza F1 y F2 en carpetas separadas. Los originales se conservan en data/raw, los derivados se reservaron para data/processed y las funciones compartidas están en src. El README explica el objetivo, la estructura y las instrucciones de ejecución.</w:t>
+      </w:r>
+    </w:p>
+    <w:p>
+      <w:r>
+        <w:t>Repositorio del proyecto: https://github.com/vbravo29/sumativo-1</w:t>
+      </w:r>
+    </w:p>
+    <w:tbl>
+      <w:tblPr>
+        <w:tblW w:w="0" w:type="auto"/>
+        <w:jc w:val="center"/>
+        <w:tblBorders>
+          <w:top w:val="single" w:sz="4" w:space="0" w:color="D9D9D9"/>
+          <w:left w:val="single" w:sz="4" w:space="0" w:color="D9D9D9"/>
+          <w:bottom w:val="single" w:sz="4" w:space="0" w:color="D9D9D9"/>
+          <w:right w:val="single" w:sz="4" w:space="0" w:color="D9D9D9"/>
+          <w:insideH w:val="single" w:sz="4" w:space="0" w:color="D9D9D9"/>
+          <w:insideV w:val="single" w:sz="4" w:space="0" w:color="D9D9D9"/>
+        </w:tblBorders>
+        <w:tblLayout w:type="fixed"/>
+        <w:tblLook w:val="04A0" w:firstRow="1" w:lastRow="0" w:firstColumn="1" w:lastColumn="0" w:noHBand="0" w:noVBand="1"/>
+      </w:tblPr>
+      <w:tblGrid>
+        <w:gridCol w:w="1440"/>
+        <w:gridCol w:w="3096"/>
+        <w:gridCol w:w="5688"/>
+      </w:tblGrid>
+      <w:tr>
+        <w:trPr>
+          <w:cantSplit/>
+          <w:tblHeader/>
+          <w:jc w:val="center"/>
+        </w:trPr>
+        <w:tc>
+          <w:tcPr>
+            <w:tcW w:w="1440" w:type="dxa"/>
+            <w:shd w:val="clear" w:color="auto" w:fill="E7EEF4"/>
+            <w:tcMar>
+              <w:top w:w="90" w:type="dxa"/>
+              <w:left w:w="90" w:type="dxa"/>
+              <w:bottom w:w="90" w:type="dxa"/>
+              <w:right w:w="90" w:type="dxa"/>
+            </w:tcMar>
+            <w:vAlign w:val="center"/>
+          </w:tcPr>
+          <w:p>
+            <w:pPr>
+              <w:spacing w:after="40" w:line="247" w:lineRule="auto"/>
+            </w:pPr>
+            <w:r>
+              <w:rPr>
+                <w:b/>
+                <w:sz w:val="20"/>
+              </w:rPr>
+              <w:t>Commit</w:t>
+            </w:r>
+          </w:p>
+        </w:tc>
+        <w:tc>
+          <w:tcPr>
+            <w:tcW w:w="3096" w:type="dxa"/>
+            <w:shd w:val="clear" w:color="auto" w:fill="E7EEF4"/>
+            <w:tcMar>
+              <w:top w:w="90" w:type="dxa"/>
+              <w:left w:w="90" w:type="dxa"/>
+              <w:bottom w:w="90" w:type="dxa"/>
+              <w:right w:w="90" w:type="dxa"/>
+            </w:tcMar>
+            <w:vAlign w:val="center"/>
+          </w:tcPr>
+          <w:p>
+            <w:pPr>
+              <w:spacing w:after="40" w:line="247" w:lineRule="auto"/>
+            </w:pPr>
+            <w:r>
+              <w:rPr>
+                <w:b/>
+                <w:sz w:val="20"/>
+              </w:rPr>
+              <w:t>Autor registrado</w:t>
+            </w:r>
+          </w:p>
+        </w:tc>
+        <w:tc>
+          <w:tcPr>
+            <w:tcW w:w="5688" w:type="dxa"/>
+            <w:shd w:val="clear" w:color="auto" w:fill="E7EEF4"/>
+            <w:tcMar>
+              <w:top w:w="90" w:type="dxa"/>
+              <w:left w:w="90" w:type="dxa"/>
+              <w:bottom w:w="90" w:type="dxa"/>
+              <w:right w:w="90" w:type="dxa"/>
+            </w:tcMar>
+            <w:vAlign w:val="center"/>
+          </w:tcPr>
+          <w:p>
+            <w:pPr>
+              <w:spacing w:after="40" w:line="247" w:lineRule="auto"/>
+            </w:pPr>
+            <w:r>
+              <w:rPr>
+                <w:b/>
+                <w:sz w:val="20"/>
+              </w:rPr>
+              <w:t>Avance</w:t>
+            </w:r>
+          </w:p>
+        </w:tc>
+      </w:tr>
+      <w:tr>
+        <w:trPr>
+          <w:cantSplit/>
+          <w:jc w:val="center"/>
+        </w:trPr>
+        <w:tc>
+          <w:tcPr>
+            <w:tcW w:w="1440" w:type="dxa"/>
+            <w:shd w:val="clear" w:color="auto" w:fill="FFFFFF"/>
+            <w:tcMar>
+              <w:top w:w="90" w:type="dxa"/>
+              <w:left w:w="90" w:type="dxa"/>
+              <w:bottom w:w="90" w:type="dxa"/>
+              <w:right w:w="90" w:type="dxa"/>
+            </w:tcMar>
+            <w:vAlign w:val="center"/>
+          </w:tcPr>
+          <w:p>
+            <w:pPr>
+              <w:spacing w:after="40" w:line="247" w:lineRule="auto"/>
+            </w:pPr>
+            <w:r>
+              <w:rPr>
+                <w:sz w:val="20"/>
+              </w:rPr>
+              <w:t>7565825</w:t>
+            </w:r>
+          </w:p>
+        </w:tc>
+        <w:tc>
+          <w:tcPr>
+            <w:tcW w:w="3096" w:type="dxa"/>
+            <w:shd w:val="clear" w:color="auto" w:fill="FFFFFF"/>
+            <w:tcMar>
+              <w:top w:w="90" w:type="dxa"/>
+              <w:left w:w="90" w:type="dxa"/>
+              <w:bottom w:w="90" w:type="dxa"/>
+              <w:right w:w="90" w:type="dxa"/>
+            </w:tcMar>
+            <w:vAlign w:val="center"/>
+          </w:tcPr>
+          <w:p>
+            <w:pPr>
+              <w:spacing w:after="40" w:line="247" w:lineRule="auto"/>
+            </w:pPr>
+            <w:r>
+              <w:rPr>
+                <w:sz w:val="20"/>
+              </w:rPr>
+              <w:t>Nayadeth Garrido Ibáñez</w:t>
+            </w:r>
+          </w:p>
+        </w:tc>
+        <w:tc>
+          <w:tcPr>
+            <w:tcW w:w="5688" w:type="dxa"/>
+            <w:shd w:val="clear" w:color="auto" w:fill="FFFFFF"/>
+            <w:tcMar>
+              <w:top w:w="90" w:type="dxa"/>
+              <w:left w:w="90" w:type="dxa"/>
+              <w:bottom w:w="90" w:type="dxa"/>
+              <w:right w:w="90" w:type="dxa"/>
+            </w:tcMar>
+            <w:vAlign w:val="center"/>
+          </w:tcPr>
+          <w:p>
+            <w:pPr>
+              <w:spacing w:after="40" w:line="247" w:lineRule="auto"/>
+            </w:pPr>
+            <w:r>
+              <w:rPr>
+                <w:sz w:val="20"/>
+              </w:rPr>
+              <w:t>Estructura del informe.</w:t>
+            </w:r>
+          </w:p>
+        </w:tc>
+      </w:tr>
+      <w:tr>
+        <w:trPr>
+          <w:cantSplit/>
+          <w:jc w:val="center"/>
+        </w:trPr>
+        <w:tc>
+          <w:tcPr>
+            <w:tcW w:w="1440" w:type="dxa"/>
+            <w:shd w:val="clear" w:color="auto" w:fill="FFFFFF"/>
+            <w:tcMar>
+              <w:top w:w="90" w:type="dxa"/>
+              <w:left w:w="90" w:type="dxa"/>
+              <w:bottom w:w="90" w:type="dxa"/>
+              <w:right w:w="90" w:type="dxa"/>
+            </w:tcMar>
+            <w:vAlign w:val="center"/>
+          </w:tcPr>
+          <w:p>
+            <w:pPr>
+              <w:spacing w:after="40" w:line="247" w:lineRule="auto"/>
+            </w:pPr>
+            <w:r>
+              <w:rPr>
+                <w:sz w:val="20"/>
+              </w:rPr>
+              <w:t>25f4703</w:t>
+            </w:r>
+          </w:p>
+        </w:tc>
+        <w:tc>
+          <w:tcPr>
+            <w:tcW w:w="3096" w:type="dxa"/>
+            <w:shd w:val="clear" w:color="auto" w:fill="FFFFFF"/>
+            <w:tcMar>
+              <w:top w:w="90" w:type="dxa"/>
+              <w:left w:w="90" w:type="dxa"/>
+              <w:bottom w:w="90" w:type="dxa"/>
+              <w:right w:w="90" w:type="dxa"/>
+            </w:tcMar>
+            <w:vAlign w:val="center"/>
+          </w:tcPr>
+          <w:p>
+            <w:pPr>
+              <w:spacing w:after="40" w:line="247" w:lineRule="auto"/>
+            </w:pPr>
+            <w:r>
+              <w:rPr>
+                <w:sz w:val="20"/>
+              </w:rPr>
+              <w:t>Victor Bravo Barrera</w:t>
+            </w:r>
+          </w:p>
+        </w:tc>
+        <w:tc>
+          <w:tcPr>
+            <w:tcW w:w="5688" w:type="dxa"/>
+            <w:shd w:val="clear" w:color="auto" w:fill="FFFFFF"/>
+            <w:tcMar>
+              <w:top w:w="90" w:type="dxa"/>
+              <w:left w:w="90" w:type="dxa"/>
+              <w:bottom w:w="90" w:type="dxa"/>
+              <w:right w:w="90" w:type="dxa"/>
+            </w:tcMar>
+            <w:vAlign w:val="center"/>
+          </w:tcPr>
+          <w:p>
+            <w:pPr>
+              <w:spacing w:after="40" w:line="247" w:lineRule="auto"/>
+            </w:pPr>
+            <w:r>
+              <w:rPr>
+                <w:sz w:val="20"/>
+              </w:rPr>
+              <w:t>Incorporación del dataset del sector Salud.</w:t>
+            </w:r>
+          </w:p>
+        </w:tc>
+      </w:tr>
+      <w:tr>
+        <w:trPr>
+          <w:cantSplit/>
+          <w:jc w:val="center"/>
+        </w:trPr>
+        <w:tc>
+          <w:tcPr>
+            <w:tcW w:w="1440" w:type="dxa"/>
+            <w:shd w:val="clear" w:color="auto" w:fill="FFFFFF"/>
+            <w:tcMar>
+              <w:top w:w="90" w:type="dxa"/>
+              <w:left w:w="90" w:type="dxa"/>
+              <w:bottom w:w="90" w:type="dxa"/>
+              <w:right w:w="90" w:type="dxa"/>
+            </w:tcMar>
+            <w:vAlign w:val="center"/>
+          </w:tcPr>
+          <w:p>
+            <w:pPr>
+              <w:spacing w:after="40" w:line="247" w:lineRule="auto"/>
+            </w:pPr>
+            <w:r>
+              <w:rPr>
+                <w:sz w:val="20"/>
+              </w:rPr>
+              <w:t>72fd51c</w:t>
+            </w:r>
+          </w:p>
+        </w:tc>
+        <w:tc>
+          <w:tcPr>
+            <w:tcW w:w="3096" w:type="dxa"/>
+            <w:shd w:val="clear" w:color="auto" w:fill="FFFFFF"/>
+            <w:tcMar>
+              <w:top w:w="90" w:type="dxa"/>
+              <w:left w:w="90" w:type="dxa"/>
+              <w:bottom w:w="90" w:type="dxa"/>
+              <w:right w:w="90" w:type="dxa"/>
+            </w:tcMar>
+            <w:vAlign w:val="center"/>
+          </w:tcPr>
+          <w:p>
+            <w:pPr>
+              <w:spacing w:after="40" w:line="247" w:lineRule="auto"/>
+            </w:pPr>
+            <w:r>
+              <w:rPr>
+                <w:sz w:val="20"/>
+              </w:rPr>
+              <w:t>Nayadeth Garrido Ibáñez</w:t>
+            </w:r>
+          </w:p>
+        </w:tc>
+        <w:tc>
+          <w:tcPr>
+            <w:tcW w:w="5688" w:type="dxa"/>
+            <w:shd w:val="clear" w:color="auto" w:fill="FFFFFF"/>
+            <w:tcMar>
+              <w:top w:w="90" w:type="dxa"/>
+              <w:left w:w="90" w:type="dxa"/>
+              <w:bottom w:w="90" w:type="dxa"/>
+              <w:right w:w="90" w:type="dxa"/>
+            </w:tcMar>
+            <w:vAlign w:val="center"/>
+          </w:tcPr>
+          <w:p>
+            <w:pPr>
+              <w:spacing w:after="40" w:line="247" w:lineRule="auto"/>
+            </w:pPr>
+            <w:r>
+              <w:rPr>
+                <w:sz w:val="20"/>
+              </w:rPr>
+              <w:t>Corrección del nombre de archivo del validador.</w:t>
+            </w:r>
+          </w:p>
+        </w:tc>
+      </w:tr>
+      <w:tr>
+        <w:trPr>
+          <w:cantSplit/>
+          <w:jc w:val="center"/>
+        </w:trPr>
+        <w:tc>
+          <w:tcPr>
+            <w:tcW w:w="1440" w:type="dxa"/>
+            <w:shd w:val="clear" w:color="auto" w:fill="FFFFFF"/>
+            <w:tcMar>
+              <w:top w:w="90" w:type="dxa"/>
+              <w:left w:w="90" w:type="dxa"/>
+              <w:bottom w:w="90" w:type="dxa"/>
+              <w:right w:w="90" w:type="dxa"/>
+            </w:tcMar>
+            <w:vAlign w:val="center"/>
+          </w:tcPr>
+          <w:p>
+            <w:pPr>
+              <w:spacing w:after="40" w:line="247" w:lineRule="auto"/>
+            </w:pPr>
+            <w:r>
+              <w:rPr>
+                <w:sz w:val="20"/>
+              </w:rPr>
+              <w:t>34d92c2</w:t>
+            </w:r>
+          </w:p>
+        </w:tc>
+        <w:tc>
+          <w:tcPr>
+            <w:tcW w:w="3096" w:type="dxa"/>
+            <w:shd w:val="clear" w:color="auto" w:fill="FFFFFF"/>
+            <w:tcMar>
+              <w:top w:w="90" w:type="dxa"/>
+              <w:left w:w="90" w:type="dxa"/>
+              <w:bottom w:w="90" w:type="dxa"/>
+              <w:right w:w="90" w:type="dxa"/>
+            </w:tcMar>
+            <w:vAlign w:val="center"/>
+          </w:tcPr>
+          <w:p>
+            <w:pPr>
+              <w:spacing w:after="40" w:line="247" w:lineRule="auto"/>
+            </w:pPr>
+            <w:r>
+              <w:rPr>
+                <w:sz w:val="20"/>
+              </w:rPr>
+              <w:t>Victor Bravo Barrera</w:t>
+            </w:r>
+          </w:p>
+        </w:tc>
+        <w:tc>
+          <w:tcPr>
+            <w:tcW w:w="5688" w:type="dxa"/>
+            <w:shd w:val="clear" w:color="auto" w:fill="FFFFFF"/>
+            <w:tcMar>
+              <w:top w:w="90" w:type="dxa"/>
+              <w:left w:w="90" w:type="dxa"/>
+              <w:bottom w:w="90" w:type="dxa"/>
+              <w:right w:w="90" w:type="dxa"/>
+            </w:tcMar>
+            <w:vAlign w:val="center"/>
+          </w:tcPr>
+          <w:p>
+            <w:pPr>
+              <w:spacing w:after="40" w:line="247" w:lineRule="auto"/>
+            </w:pPr>
+            <w:r>
+              <w:rPr>
+                <w:sz w:val="20"/>
+              </w:rPr>
+              <w:t>Desarrollo de F1 y organización de archivos.</w:t>
+            </w:r>
+          </w:p>
+        </w:tc>
+      </w:tr>
+    </w:tbl>
+    <w:p/>
+    <w:p>
+      <w:r>
+        <w:t>El historial local muestra contribuciones y cambios progresivos. La revisión del mapa, el diccionario y este informe deberá registrarse en los siguientes commits, sin atribuirles una publicación que aún no ha sido verificada.</w:t>
+      </w:r>
+    </w:p>
+    <w:p>
+      <w:pPr>
+        <w:pStyle w:val="Ttulo21"/>
+      </w:pPr>
+      <w:r>
+        <w:t>Decisiones de la fase</w:t>
+      </w:r>
+    </w:p>
+    <w:p>
+      <w:r>
+        <w:t>Se acotó la pregunta a tipo de licitación, tamaño del proveedor y resultado de la oferta para mantener un objetivo medible. Los montos quedaron fuera de la comparación principal, porque requieren confirmar su significado y moneda. Se conservan los datos originales y se posponen las transformaciones hasta contar con reglas justificadas.</w:t>
+      </w:r>
+    </w:p>
+    <w:p>
+      <w:r>
+        <w:t>La modularidad se resuelve con funciones de parámetros definidos, sin añadir clases que no aporten a las operaciones iniciales. El registro de versiones, la lectura y la comprobación de integridad quedan separados del texto que explica el proyecto.</w:t>
+      </w:r>
+    </w:p>
+    <w:p>
+      <w:pPr>
+        <w:pStyle w:val="Ttulo21"/>
+      </w:pPr>
+      <w:r>
+        <w:t>Preparación de F2</w:t>
+      </w:r>
+    </w:p>
+    <w:p>
+      <w:r>
+        <w:t>F2 permanece pendiente. Su desarrollo incluirá exploración de distribuciones, revisión de claves y duplicados, manejo de faltantes, conversión de fechas y tipos y validación de los datos resultantes. Cada cambio debe indicar su motivo y efecto en los registros. Los resultados se guardarán en data/processed, sin sobrescribir el CSV original.</w:t>
+      </w:r>
+    </w:p>
+    <w:p>
+      <w:r>
+        <w:br w:type="page"/>
+      </w:r>
+    </w:p>
+    <w:p>
+      <w:pPr>
+        <w:pStyle w:val="Ttulo11"/>
+      </w:pPr>
+      <w:bookmarkStart w:id="5" w:name="_Toc240146704"/>
+      <w:r>
+        <w:lastRenderedPageBreak/>
+        <w:t>Vinculación con el mapa conceptual</w:t>
+      </w:r>
+      <w:bookmarkEnd w:id="5"/>
+    </w:p>
+    <w:p>
+      <w:r>
+        <w:t>El mapa reúne la pregunta del proyecto, los datos de entrada, las herramientas y las fases de trabajo. Se elaboró a partir del avance actual. Sus componentes de F1 tienen implementación; F2 está pendiente y F3–F4 representan una planificación que se ajustará a sus pautas.</w:t>
+      </w:r>
+    </w:p>
+    <w:p>
+      <w:r>
         <w:rPr>
-          <w:b/>
-          <w:bCs/>
-          <w:color w:val="000000" w:themeColor="text1"/>
-          <w:sz w:val="72"/>
-          <w:szCs w:val="72"/>
-          <w:lang w:eastAsia="es-ES" w:bidi="es-ES"/>
+          <w:noProof/>
         </w:rPr>
-      </w:pPr>
+        <w:drawing>
+          <wp:inline distT="0" distB="0" distL="0" distR="0" wp14:anchorId="0FB90707" wp14:editId="484F4E3E">
+            <wp:extent cx="6492240" cy="2813304"/>
+            <wp:effectExtent l="0" t="0" r="0" b="0"/>
+            <wp:docPr id="12" name="Picture 12"/>
+            <wp:cNvGraphicFramePr>
+              <a:graphicFrameLocks xmlns:a="http://schemas.openxmlformats.org/drawingml/2006/main" noChangeAspect="1"/>
+            </wp:cNvGraphicFramePr>
+            <a:graphic xmlns:a="http://schemas.openxmlformats.org/drawingml/2006/main">
+              <a:graphicData uri="http://schemas.openxmlformats.org/drawingml/2006/picture">
+                <pic:pic xmlns:pic="http://schemas.openxmlformats.org/drawingml/2006/picture">
+                  <pic:nvPicPr>
+                    <pic:cNvPr id="0" name="mapa_sintesis.png"/>
+                    <pic:cNvPicPr/>
+                  </pic:nvPicPr>
+                  <pic:blipFill>
+                    <a:blip r:embed="rId22"/>
+                    <a:stretch>
+                      <a:fillRect/>
+                    </a:stretch>
+                  </pic:blipFill>
+                  <pic:spPr>
+                    <a:xfrm>
+                      <a:off x="0" y="0"/>
+                      <a:ext cx="6492240" cy="2813304"/>
+                    </a:xfrm>
+                    <a:prstGeom prst="rect">
+                      <a:avLst/>
+                    </a:prstGeom>
+                  </pic:spPr>
+                </pic:pic>
+              </a:graphicData>
+            </a:graphic>
+          </wp:inline>
+        </w:drawing>
+      </w:r>
+    </w:p>
+    <w:p>
+      <w:pPr>
+        <w:pStyle w:val="Descripcin1"/>
+      </w:pPr>
+      <w:r>
+        <w:t>Figura 1. Síntesis del mapa conceptual. El archivo editable completo se encuentra en docs/mapa_conceptual_f1_f2.drawio.</w:t>
+      </w:r>
+    </w:p>
+    <w:tbl>
+      <w:tblPr>
+        <w:tblW w:w="0" w:type="auto"/>
+        <w:jc w:val="center"/>
+        <w:tblBorders>
+          <w:top w:val="single" w:sz="4" w:space="0" w:color="D9D9D9"/>
+          <w:left w:val="single" w:sz="4" w:space="0" w:color="D9D9D9"/>
+          <w:bottom w:val="single" w:sz="4" w:space="0" w:color="D9D9D9"/>
+          <w:right w:val="single" w:sz="4" w:space="0" w:color="D9D9D9"/>
+          <w:insideH w:val="single" w:sz="4" w:space="0" w:color="D9D9D9"/>
+          <w:insideV w:val="single" w:sz="4" w:space="0" w:color="D9D9D9"/>
+        </w:tblBorders>
+        <w:tblLayout w:type="fixed"/>
+        <w:tblLook w:val="04A0" w:firstRow="1" w:lastRow="0" w:firstColumn="1" w:lastColumn="0" w:noHBand="0" w:noVBand="1"/>
+      </w:tblPr>
+      <w:tblGrid>
+        <w:gridCol w:w="2880"/>
+        <w:gridCol w:w="7344"/>
+      </w:tblGrid>
+      <w:tr>
+        <w:trPr>
+          <w:cantSplit/>
+          <w:tblHeader/>
+          <w:jc w:val="center"/>
+        </w:trPr>
+        <w:tc>
+          <w:tcPr>
+            <w:tcW w:w="2880" w:type="dxa"/>
+            <w:shd w:val="clear" w:color="auto" w:fill="E7EEF4"/>
+            <w:tcMar>
+              <w:top w:w="90" w:type="dxa"/>
+              <w:left w:w="90" w:type="dxa"/>
+              <w:bottom w:w="90" w:type="dxa"/>
+              <w:right w:w="90" w:type="dxa"/>
+            </w:tcMar>
+            <w:vAlign w:val="center"/>
+          </w:tcPr>
+          <w:p>
+            <w:pPr>
+              <w:spacing w:after="40" w:line="247" w:lineRule="auto"/>
+            </w:pPr>
+            <w:r>
+              <w:rPr>
+                <w:b/>
+                <w:sz w:val="20"/>
+              </w:rPr>
+              <w:t>Componente del mapa</w:t>
+            </w:r>
+          </w:p>
+        </w:tc>
+        <w:tc>
+          <w:tcPr>
+            <w:tcW w:w="7344" w:type="dxa"/>
+            <w:shd w:val="clear" w:color="auto" w:fill="E7EEF4"/>
+            <w:tcMar>
+              <w:top w:w="90" w:type="dxa"/>
+              <w:left w:w="90" w:type="dxa"/>
+              <w:bottom w:w="90" w:type="dxa"/>
+              <w:right w:w="90" w:type="dxa"/>
+            </w:tcMar>
+            <w:vAlign w:val="center"/>
+          </w:tcPr>
+          <w:p>
+            <w:pPr>
+              <w:spacing w:after="40" w:line="247" w:lineRule="auto"/>
+            </w:pPr>
+            <w:r>
+              <w:rPr>
+                <w:b/>
+                <w:sz w:val="20"/>
+              </w:rPr>
+              <w:t>Correspondencia en el proyecto</w:t>
+            </w:r>
+          </w:p>
+        </w:tc>
+      </w:tr>
+      <w:tr>
+        <w:trPr>
+          <w:cantSplit/>
+          <w:jc w:val="center"/>
+        </w:trPr>
+        <w:tc>
+          <w:tcPr>
+            <w:tcW w:w="2880" w:type="dxa"/>
+            <w:shd w:val="clear" w:color="auto" w:fill="FFFFFF"/>
+            <w:tcMar>
+              <w:top w:w="90" w:type="dxa"/>
+              <w:left w:w="90" w:type="dxa"/>
+              <w:bottom w:w="90" w:type="dxa"/>
+              <w:right w:w="90" w:type="dxa"/>
+            </w:tcMar>
+            <w:vAlign w:val="center"/>
+          </w:tcPr>
+          <w:p>
+            <w:pPr>
+              <w:spacing w:after="40" w:line="247" w:lineRule="auto"/>
+            </w:pPr>
+            <w:r>
+              <w:rPr>
+                <w:sz w:val="20"/>
+              </w:rPr>
+              <w:t>Problema y objetivos</w:t>
+            </w:r>
+          </w:p>
+        </w:tc>
+        <w:tc>
+          <w:tcPr>
+            <w:tcW w:w="7344" w:type="dxa"/>
+            <w:shd w:val="clear" w:color="auto" w:fill="FFFFFF"/>
+            <w:tcMar>
+              <w:top w:w="90" w:type="dxa"/>
+              <w:left w:w="90" w:type="dxa"/>
+              <w:bottom w:w="90" w:type="dxa"/>
+              <w:right w:w="90" w:type="dxa"/>
+            </w:tcMar>
+            <w:vAlign w:val="center"/>
+          </w:tcPr>
+          <w:p>
+            <w:pPr>
+              <w:spacing w:after="40" w:line="247" w:lineRule="auto"/>
+            </w:pPr>
+            <w:r>
+              <w:rPr>
+                <w:sz w:val="20"/>
+              </w:rPr>
+              <w:t>Secciones 1–4 del notebook F1.</w:t>
+            </w:r>
+          </w:p>
+        </w:tc>
+      </w:tr>
+      <w:tr>
+        <w:trPr>
+          <w:cantSplit/>
+          <w:jc w:val="center"/>
+        </w:trPr>
+        <w:tc>
+          <w:tcPr>
+            <w:tcW w:w="2880" w:type="dxa"/>
+            <w:shd w:val="clear" w:color="auto" w:fill="FFFFFF"/>
+            <w:tcMar>
+              <w:top w:w="90" w:type="dxa"/>
+              <w:left w:w="90" w:type="dxa"/>
+              <w:bottom w:w="90" w:type="dxa"/>
+              <w:right w:w="90" w:type="dxa"/>
+            </w:tcMar>
+            <w:vAlign w:val="center"/>
+          </w:tcPr>
+          <w:p>
+            <w:pPr>
+              <w:spacing w:after="40" w:line="247" w:lineRule="auto"/>
+            </w:pPr>
+            <w:r>
+              <w:rPr>
+                <w:sz w:val="20"/>
+              </w:rPr>
+              <w:t>Datos y variables</w:t>
+            </w:r>
+          </w:p>
+        </w:tc>
+        <w:tc>
+          <w:tcPr>
+            <w:tcW w:w="7344" w:type="dxa"/>
+            <w:shd w:val="clear" w:color="auto" w:fill="FFFFFF"/>
+            <w:tcMar>
+              <w:top w:w="90" w:type="dxa"/>
+              <w:left w:w="90" w:type="dxa"/>
+              <w:bottom w:w="90" w:type="dxa"/>
+              <w:right w:w="90" w:type="dxa"/>
+            </w:tcMar>
+            <w:vAlign w:val="center"/>
+          </w:tcPr>
+          <w:p>
+            <w:pPr>
+              <w:spacing w:after="40" w:line="247" w:lineRule="auto"/>
+            </w:pPr>
+            <w:r>
+              <w:rPr>
+                <w:sz w:val="20"/>
+              </w:rPr>
+              <w:t>data/README.md y DICCIONARIO_VARIABLES.md.</w:t>
+            </w:r>
+          </w:p>
+        </w:tc>
+      </w:tr>
+      <w:tr>
+        <w:trPr>
+          <w:cantSplit/>
+          <w:jc w:val="center"/>
+        </w:trPr>
+        <w:tc>
+          <w:tcPr>
+            <w:tcW w:w="2880" w:type="dxa"/>
+            <w:shd w:val="clear" w:color="auto" w:fill="FFFFFF"/>
+            <w:tcMar>
+              <w:top w:w="90" w:type="dxa"/>
+              <w:left w:w="90" w:type="dxa"/>
+              <w:bottom w:w="90" w:type="dxa"/>
+              <w:right w:w="90" w:type="dxa"/>
+            </w:tcMar>
+            <w:vAlign w:val="center"/>
+          </w:tcPr>
+          <w:p>
+            <w:pPr>
+              <w:spacing w:after="40" w:line="247" w:lineRule="auto"/>
+            </w:pPr>
+            <w:r>
+              <w:rPr>
+                <w:sz w:val="20"/>
+              </w:rPr>
+              <w:t>Entorno y código modular</w:t>
+            </w:r>
+          </w:p>
+        </w:tc>
+        <w:tc>
+          <w:tcPr>
+            <w:tcW w:w="7344" w:type="dxa"/>
+            <w:shd w:val="clear" w:color="auto" w:fill="FFFFFF"/>
+            <w:tcMar>
+              <w:top w:w="90" w:type="dxa"/>
+              <w:left w:w="90" w:type="dxa"/>
+              <w:bottom w:w="90" w:type="dxa"/>
+              <w:right w:w="90" w:type="dxa"/>
+            </w:tcMar>
+            <w:vAlign w:val="center"/>
+          </w:tcPr>
+          <w:p>
+            <w:pPr>
+              <w:spacing w:after="40" w:line="247" w:lineRule="auto"/>
+            </w:pPr>
+            <w:r>
+              <w:rPr>
+                <w:sz w:val="20"/>
+              </w:rPr>
+              <w:t>requirements.txt, README y src/proyecto.py.</w:t>
+            </w:r>
+          </w:p>
+        </w:tc>
+      </w:tr>
+      <w:tr>
+        <w:trPr>
+          <w:cantSplit/>
+          <w:jc w:val="center"/>
+        </w:trPr>
+        <w:tc>
+          <w:tcPr>
+            <w:tcW w:w="2880" w:type="dxa"/>
+            <w:shd w:val="clear" w:color="auto" w:fill="FFFFFF"/>
+            <w:tcMar>
+              <w:top w:w="90" w:type="dxa"/>
+              <w:left w:w="90" w:type="dxa"/>
+              <w:bottom w:w="90" w:type="dxa"/>
+              <w:right w:w="90" w:type="dxa"/>
+            </w:tcMar>
+            <w:vAlign w:val="center"/>
+          </w:tcPr>
+          <w:p>
+            <w:pPr>
+              <w:spacing w:after="40" w:line="247" w:lineRule="auto"/>
+            </w:pPr>
+            <w:r>
+              <w:rPr>
+                <w:sz w:val="20"/>
+              </w:rPr>
+              <w:t>Verificación y evidencias</w:t>
+            </w:r>
+          </w:p>
+        </w:tc>
+        <w:tc>
+          <w:tcPr>
+            <w:tcW w:w="7344" w:type="dxa"/>
+            <w:shd w:val="clear" w:color="auto" w:fill="FFFFFF"/>
+            <w:tcMar>
+              <w:top w:w="90" w:type="dxa"/>
+              <w:left w:w="90" w:type="dxa"/>
+              <w:bottom w:w="90" w:type="dxa"/>
+              <w:right w:w="90" w:type="dxa"/>
+            </w:tcMar>
+            <w:vAlign w:val="center"/>
+          </w:tcPr>
+          <w:p>
+            <w:pPr>
+              <w:spacing w:after="40" w:line="247" w:lineRule="auto"/>
+            </w:pPr>
+            <w:r>
+              <w:rPr>
+                <w:sz w:val="20"/>
+              </w:rPr>
+              <w:t>Secciones 7–8 de F1 y evidencias/F1_ejecucion.json.</w:t>
+            </w:r>
+          </w:p>
+        </w:tc>
+      </w:tr>
+      <w:tr>
+        <w:trPr>
+          <w:cantSplit/>
+          <w:jc w:val="center"/>
+        </w:trPr>
+        <w:tc>
+          <w:tcPr>
+            <w:tcW w:w="2880" w:type="dxa"/>
+            <w:shd w:val="clear" w:color="auto" w:fill="FFFFFF"/>
+            <w:tcMar>
+              <w:top w:w="90" w:type="dxa"/>
+              <w:left w:w="90" w:type="dxa"/>
+              <w:bottom w:w="90" w:type="dxa"/>
+              <w:right w:w="90" w:type="dxa"/>
+            </w:tcMar>
+            <w:vAlign w:val="center"/>
+          </w:tcPr>
+          <w:p>
+            <w:pPr>
+              <w:spacing w:after="40" w:line="247" w:lineRule="auto"/>
+            </w:pPr>
+            <w:r>
+              <w:rPr>
+                <w:sz w:val="20"/>
+              </w:rPr>
+              <w:t>F2 y fases posteriores</w:t>
+            </w:r>
+          </w:p>
+        </w:tc>
+        <w:tc>
+          <w:tcPr>
+            <w:tcW w:w="7344" w:type="dxa"/>
+            <w:shd w:val="clear" w:color="auto" w:fill="FFFFFF"/>
+            <w:tcMar>
+              <w:top w:w="90" w:type="dxa"/>
+              <w:left w:w="90" w:type="dxa"/>
+              <w:bottom w:w="90" w:type="dxa"/>
+              <w:right w:w="90" w:type="dxa"/>
+            </w:tcMar>
+            <w:vAlign w:val="center"/>
+          </w:tcPr>
+          <w:p>
+            <w:pPr>
+              <w:spacing w:after="40" w:line="247" w:lineRule="auto"/>
+            </w:pPr>
+            <w:r>
+              <w:rPr>
+                <w:sz w:val="20"/>
+              </w:rPr>
+              <w:t>Notebook F2 por desarrollar y objetivos proyectados.</w:t>
+            </w:r>
+          </w:p>
+        </w:tc>
+      </w:tr>
+    </w:tbl>
+    <w:p/>
+    <w:p>
+      <w:r>
+        <w:t>El equipo deberá revisar el mapa y el diccionario antes del cierre. Las fuentes docentes y sus citas se incorporarán en una próxima revisión. El nombre del docente de la portada también está pendiente de completar.</w:t>
+      </w:r>
+    </w:p>
+    <w:p>
+      <w:r>
+        <w:br w:type="page"/>
+      </w:r>
+    </w:p>
+    <w:p>
+      <w:pPr>
+        <w:pStyle w:val="Ttulo11"/>
+      </w:pPr>
+      <w:bookmarkStart w:id="6" w:name="_Toc240146705"/>
+      <w:r>
+        <w:lastRenderedPageBreak/>
+        <w:t>Referencias</w:t>
+      </w:r>
+      <w:bookmarkEnd w:id="6"/>
+    </w:p>
+    <w:p>
+      <w:pPr>
+        <w:spacing w:after="240"/>
+        <w:ind w:left="432" w:hanging="432"/>
+      </w:pPr>
+      <w:r>
+        <w:t>ChileCompra. (s. f.-a). Descargas. https://datos-abiertos.chilecompra.cl/descargas</w:t>
+      </w:r>
+    </w:p>
+    <w:p>
+      <w:pPr>
+        <w:spacing w:after="240"/>
+        <w:ind w:left="432" w:hanging="432"/>
+      </w:pPr>
+      <w:r>
+        <w:t>ChileCompra. (s. f.-b). Diccionario de datos: Licitaciones. https://www.chilecompra.cl/wp-content/uploads/2026/03/Documentacion-API-Mercado-Publico-Licitaciones.pdf</w:t>
+      </w:r>
+    </w:p>
+    <w:p>
+      <w:pPr>
+        <w:spacing w:after="240"/>
+        <w:ind w:left="432" w:hanging="432"/>
+      </w:pPr>
+      <w:r>
+        <w:t>ChileCompra. (s. f.-c). Definiciones. https://datos-abiertos.chilecompra.cl/datos-abiertos/definiciones</w:t>
+      </w:r>
+    </w:p>
+    <w:p>
+      <w:pPr>
+        <w:spacing w:after="240"/>
+        <w:ind w:left="432" w:hanging="432"/>
+      </w:pPr>
+      <w:r>
+        <w:t>NumPy Developers. (s. f.). numpy.arange. NumPy documentation. https://numpy.org/doc/stable/reference/generated/numpy.arange.html</w:t>
+      </w:r>
+    </w:p>
+    <w:p>
+      <w:pPr>
+        <w:spacing w:after="240"/>
+        <w:ind w:left="432" w:hanging="432"/>
+      </w:pPr>
+      <w:r>
+        <w:t>Samuel, S., &amp; Mietchen, D. (2024). Computational reproducibility of Jupyter notebooks from biomedical publications. GigaScience, 13, giad113. https://doi.org/10.1093/gigascience/giad113</w:t>
+      </w:r>
+    </w:p>
+    <w:p>
+      <w:pPr>
+        <w:spacing w:after="240"/>
+        <w:ind w:left="432" w:hanging="432"/>
+      </w:pPr>
+      <w:r>
+        <w:t>The pandas development team. (s. f.). pandas.read_csv. pandas documentation. https://pandas.pydata.org/docs/reference/api/pandas.read_csv.html</w:t>
+      </w:r>
+    </w:p>
+    <w:p>
+      <w:r>
+        <w:t>Pendiente de incorporación: dos materiales docentes del curso y sus citas en el desarrollo. Las referencias anteriores no sustituyen ese requisito.</w:t>
+      </w:r>
+    </w:p>
+    <w:p>
+      <w:pPr>
+        <w:pStyle w:val="Ttulo21"/>
+      </w:pPr>
+      <w:r>
+        <w:t>Documentos técnicos del repositorio</w:t>
+      </w:r>
+    </w:p>
+    <w:p>
+      <w:r>
+        <w:t>F1/F1_Definición.ipynb; F1/verificar_f1.py; data/DICCIONARIO_VARIABLES.md; data/README.md; docs/mapa_conceptual_f1_f2.drawio; evidencias/F1_ejecucion.json. Estos archivos respaldan la definición, la preparación técnica y las comprobaciones descritas.</w:t>
+      </w:r>
+    </w:p>
+    <w:p>
+      <w:r>
+        <w:t>SHA-256 del CSV original:</w:t>
+      </w:r>
+    </w:p>
+    <w:p>
       <w:r>
         <w:rPr>
-          <w:b/>
-          <w:bCs/>
-          <w:color w:val="000000" w:themeColor="text1"/>
-          <w:sz w:val="72"/>
-          <w:szCs w:val="72"/>
-          <w:lang w:eastAsia="es-ES" w:bidi="es-ES"/>
+          <w:sz w:val="18"/>
         </w:rPr>
-        <w:t xml:space="preserve">AVANCE DEL PROYECTO FASE 1 </w:t>
-      </w:r>
-    </w:p>
-    <w:p>
-      <w:pPr>
-        <w:pStyle w:val="Textoindependiente"/>
-        <w:rPr>
-          <w:b/>
-          <w:sz w:val="20"/>
-        </w:rPr>
-      </w:pPr>
-    </w:p>
-    <w:p>
-      <w:pPr>
-        <w:pStyle w:val="Textoindependiente"/>
-        <w:rPr>
-          <w:b/>
-          <w:sz w:val="20"/>
-        </w:rPr>
-      </w:pPr>
-    </w:p>
-    <w:p>
-      <w:pPr>
-        <w:pStyle w:val="Textoindependiente"/>
-        <w:spacing w:before="1"/>
-        <w:rPr>
-          <w:b/>
-          <w:sz w:val="27"/>
-        </w:rPr>
-      </w:pPr>
-    </w:p>
-    <w:p>
-      <w:pPr>
-        <w:spacing w:before="93"/>
-        <w:ind w:left="113" w:right="8051"/>
-        <w:rPr>
-          <w:b/>
-          <w:color w:val="231F20"/>
-          <w:spacing w:val="-2"/>
-        </w:rPr>
-      </w:pPr>
-      <w:r>
-        <w:rPr>
-          <w:b/>
-          <w:color w:val="231F20"/>
-        </w:rPr>
-        <w:t>Nombre</w:t>
-      </w:r>
-      <w:r>
-        <w:rPr>
-          <w:b/>
-          <w:color w:val="231F20"/>
-          <w:spacing w:val="-5"/>
-        </w:rPr>
-        <w:t xml:space="preserve"> </w:t>
-      </w:r>
-      <w:r>
-        <w:rPr>
-          <w:b/>
-          <w:color w:val="231F20"/>
-          <w:spacing w:val="-2"/>
-        </w:rPr>
-        <w:t>integrante/s:</w:t>
-      </w:r>
-      <w:r>
-        <w:rPr>
-          <w:b/>
-          <w:color w:val="231F20"/>
-          <w:spacing w:val="-2"/>
-        </w:rPr>
-        <w:t xml:space="preserve"> Víctor Bravo Barrera</w:t>
-      </w:r>
-    </w:p>
-    <w:p>
-      <w:pPr>
-        <w:spacing w:before="93"/>
-        <w:ind w:left="113" w:right="8051"/>
-        <w:rPr>
-          <w:b/>
-          <w:color w:val="231F20"/>
-          <w:spacing w:val="-2"/>
-        </w:rPr>
-      </w:pPr>
-      <w:r>
-        <w:rPr>
-          <w:b/>
-          <w:color w:val="231F20"/>
-          <w:spacing w:val="-2"/>
-        </w:rPr>
-        <w:t>Nayadeth Garrido</w:t>
-      </w:r>
-    </w:p>
-    <w:p>
-      <w:pPr>
-        <w:spacing w:before="93"/>
-        <w:ind w:left="113" w:right="8051"/>
-        <w:rPr>
-          <w:b/>
-          <w:color w:val="231F20"/>
-          <w:spacing w:val="-2"/>
-        </w:rPr>
-      </w:pPr>
-      <w:r>
-        <w:rPr>
-          <w:b/>
-          <w:color w:val="231F20"/>
-          <w:spacing w:val="-2"/>
-        </w:rPr>
-        <w:t>Alexander Sepulveda</w:t>
-      </w:r>
-    </w:p>
-    <w:p>
-      <w:pPr>
-        <w:pStyle w:val="Textoindependiente"/>
-        <w:spacing w:before="8"/>
-        <w:rPr>
-          <w:b/>
-          <w:sz w:val="19"/>
-        </w:rPr>
-      </w:pPr>
-    </w:p>
-    <w:p>
-      <w:pPr>
-        <w:spacing w:before="1"/>
-        <w:ind w:left="113" w:right="8051"/>
-        <w:rPr>
-          <w:b/>
-        </w:rPr>
-      </w:pPr>
-      <w:r>
-        <w:rPr>
-          <w:b/>
-          <w:color w:val="231F20"/>
-          <w:spacing w:val="-2"/>
-        </w:rPr>
-        <w:t>Curso:</w:t>
-      </w:r>
-      <w:r>
-        <w:rPr>
-          <w:b/>
-          <w:color w:val="231F20"/>
-          <w:spacing w:val="-2"/>
-        </w:rPr>
-        <w:t xml:space="preserve"> Magister en ciencia de datos  e inteligencia artificial</w:t>
-      </w:r>
-    </w:p>
-    <w:p>
-      <w:pPr>
-        <w:pStyle w:val="Textoindependiente"/>
-        <w:spacing w:before="9"/>
-        <w:rPr>
-          <w:b/>
-          <w:sz w:val="19"/>
-        </w:rPr>
-      </w:pPr>
-    </w:p>
-    <w:p>
-      <w:pPr>
-        <w:spacing w:line="252" w:lineRule="exact"/>
-        <w:ind w:left="113"/>
-        <w:rPr>
-          <w:b/>
-        </w:rPr>
-        <w:sectPr>
-          <w:type w:val="continuous"/>
-          <w:pgSz w:w="12240" w:h="15840"/>
-          <w:pgMar w:top="1120" w:right="840" w:bottom="280" w:left="1020" w:header="720" w:footer="720" w:gutter="0"/>
-          <w:cols w:space="720"/>
-        </w:sectPr>
-      </w:pPr>
-      <w:r>
-        <w:rPr>
-          <w:b/>
-          <w:color w:val="231F20"/>
-          <w:spacing w:val="-2"/>
-        </w:rPr>
-        <w:t>Fecha:</w:t>
-      </w:r>
-      <w:r>
-        <w:t>16-09-2026</w:t>
-      </w:r>
-    </w:p>
-    <w:p>
-      <w:pPr>
-        <w:pStyle w:val="Textoindependiente"/>
-        <w:rPr>
-          <w:b/>
-          <w:sz w:val="9"/>
-        </w:rPr>
-      </w:pPr>
-    </w:p>
-    <w:p>
-      <w:pPr>
-        <w:spacing w:before="93"/>
-        <w:ind w:left="167"/>
-        <w:rPr>
-          <w:b/>
-          <w:color w:val="231F20"/>
-          <w:spacing w:val="-2"/>
-        </w:rPr>
-      </w:pPr>
-      <w:r>
-        <w:rPr>
-          <w:b/>
-          <w:color w:val="231F20"/>
-          <w:spacing w:val="-2"/>
-        </w:rPr>
-        <w:t>APARTADOS</w:t>
-      </w:r>
-    </w:p>
-    <w:p>
-      <w:pPr>
-        <w:spacing w:before="93"/>
-        <w:ind w:left="167"/>
-        <w:rPr>
-          <w:b/>
-          <w:color w:val="231F20"/>
-          <w:spacing w:val="-2"/>
-        </w:rPr>
-      </w:pPr>
-    </w:p>
-    <w:p>
-      <w:pPr>
-        <w:spacing w:before="93"/>
-        <w:ind w:left="167"/>
-        <w:rPr>
-          <w:b/>
-        </w:rPr>
-      </w:pPr>
-    </w:p>
-    <w:p>
-      <w:pPr>
-        <w:pStyle w:val="Prrafodelista"/>
-        <w:numPr>
-          <w:ilvl w:val="0"/>
-          <w:numId w:val="5"/>
-        </w:numPr>
-        <w:spacing w:before="120" w:after="240" w:line="276" w:lineRule="auto"/>
-        <w:ind w:right="227"/>
-      </w:pPr>
-      <w:r>
-        <w:t>Portada e Índice.</w:t>
-      </w:r>
-    </w:p>
-    <w:p>
-      <w:pPr>
-        <w:pStyle w:val="Prrafodelista"/>
-        <w:numPr>
-          <w:ilvl w:val="0"/>
-          <w:numId w:val="5"/>
-        </w:numPr>
-        <w:spacing w:before="120" w:after="240" w:line="276" w:lineRule="auto"/>
-        <w:ind w:right="227"/>
-      </w:pPr>
-      <w:r>
-        <w:rPr>
-          <w:lang w:val="es-CL"/>
-        </w:rPr>
-        <w:t>Introducción y contextualización.</w:t>
-      </w:r>
-    </w:p>
-    <w:p>
-      <w:pPr>
-        <w:pStyle w:val="Prrafodelista"/>
-        <w:numPr>
-          <w:ilvl w:val="0"/>
-          <w:numId w:val="5"/>
-        </w:numPr>
-        <w:spacing w:before="120" w:after="240" w:line="276" w:lineRule="auto"/>
-        <w:ind w:right="227"/>
-      </w:pPr>
-      <w:r>
-        <w:t>Definición de la problemática y objetivos del proyecto. </w:t>
-      </w:r>
-    </w:p>
-    <w:p>
-      <w:pPr>
-        <w:pStyle w:val="Prrafodelista"/>
-        <w:numPr>
-          <w:ilvl w:val="0"/>
-          <w:numId w:val="5"/>
-        </w:numPr>
-        <w:spacing w:before="120" w:after="240" w:line="276" w:lineRule="auto"/>
-        <w:ind w:right="227"/>
-      </w:pPr>
-      <w:r>
-        <w:rPr>
-          <w:lang w:eastAsia="es-CL" w:bidi="es-ES"/>
-        </w:rPr>
-        <w:t>Aplicación de herramientas científicas.</w:t>
-      </w:r>
-    </w:p>
-    <w:p>
-      <w:pPr>
-        <w:pStyle w:val="Prrafodelista"/>
-        <w:numPr>
-          <w:ilvl w:val="0"/>
-          <w:numId w:val="5"/>
-        </w:numPr>
-        <w:spacing w:before="120" w:after="240" w:line="276" w:lineRule="auto"/>
-        <w:ind w:right="227"/>
-      </w:pPr>
-      <w:r>
-        <w:rPr>
-          <w:lang w:val="es-CL" w:bidi="es-ES"/>
-        </w:rPr>
-        <w:t>Reproducibilidad técnica. </w:t>
-      </w:r>
-    </w:p>
-    <w:p>
-      <w:pPr>
-        <w:pStyle w:val="Prrafodelista"/>
-        <w:numPr>
-          <w:ilvl w:val="0"/>
-          <w:numId w:val="5"/>
-        </w:numPr>
-        <w:spacing w:before="120" w:after="240" w:line="276" w:lineRule="auto"/>
-        <w:ind w:right="227"/>
-      </w:pPr>
-      <w:r>
-        <w:rPr>
-          <w:lang w:val="es-CL"/>
-        </w:rPr>
-        <w:t>Control de versiones</w:t>
-      </w:r>
-    </w:p>
-    <w:p>
-      <w:pPr>
-        <w:pStyle w:val="Prrafodelista"/>
-        <w:numPr>
-          <w:ilvl w:val="0"/>
-          <w:numId w:val="5"/>
-        </w:numPr>
-        <w:spacing w:before="120" w:after="240" w:line="276" w:lineRule="auto"/>
-        <w:ind w:right="227"/>
-        <w:rPr>
-          <w:lang w:val="en-US"/>
-        </w:rPr>
-      </w:pPr>
-      <w:r>
-        <w:rPr>
-          <w:lang w:val="en-US"/>
-        </w:rPr>
-        <w:t>Notebook F1_Definición.ipynb (F1)</w:t>
-      </w:r>
-    </w:p>
-    <w:p>
-      <w:pPr>
-        <w:pStyle w:val="Prrafodelista"/>
-        <w:numPr>
-          <w:ilvl w:val="0"/>
-          <w:numId w:val="5"/>
-        </w:numPr>
-        <w:spacing w:before="120" w:after="240" w:line="276" w:lineRule="auto"/>
-        <w:ind w:right="227"/>
-        <w:rPr>
-          <w:lang w:val="es-CL"/>
-        </w:rPr>
-      </w:pPr>
-      <w:r>
-        <w:rPr>
-          <w:lang w:val="es-CL"/>
-        </w:rPr>
-        <w:t>Documentación del proceso</w:t>
-      </w:r>
-    </w:p>
-    <w:p>
-      <w:pPr>
-        <w:pStyle w:val="Prrafodelista"/>
-        <w:numPr>
-          <w:ilvl w:val="0"/>
-          <w:numId w:val="5"/>
-        </w:numPr>
-        <w:spacing w:before="120" w:after="240" w:line="276" w:lineRule="auto"/>
-        <w:ind w:right="227"/>
-        <w:rPr>
-          <w:lang w:val="es-CL"/>
-        </w:rPr>
-      </w:pPr>
-      <w:r>
-        <w:rPr>
-          <w:lang w:val="es-CL"/>
-        </w:rPr>
-        <w:t>Repositorio GitHub correspondiente a la Fase 1</w:t>
-      </w:r>
-    </w:p>
-    <w:p>
-      <w:pPr>
-        <w:pStyle w:val="Prrafodelista"/>
-        <w:numPr>
-          <w:ilvl w:val="0"/>
-          <w:numId w:val="5"/>
-        </w:numPr>
-        <w:spacing w:before="120" w:after="240" w:line="276" w:lineRule="auto"/>
-        <w:ind w:right="227"/>
-        <w:rPr>
-          <w:lang w:val="es-CL"/>
-        </w:rPr>
-      </w:pPr>
-      <w:r>
-        <w:rPr>
-          <w:lang w:val="es-CL" w:bidi="es-ES"/>
-        </w:rPr>
-        <w:t>Vinculación del mapa conceptual con el avance de proyecto</w:t>
-      </w:r>
-    </w:p>
-    <w:p>
-      <w:pPr>
-        <w:pStyle w:val="Prrafodelista"/>
-        <w:numPr>
-          <w:ilvl w:val="0"/>
-          <w:numId w:val="5"/>
-        </w:numPr>
-        <w:spacing w:before="120" w:after="240" w:line="276" w:lineRule="auto"/>
-        <w:ind w:right="227"/>
-      </w:pPr>
-      <w:r>
-        <w:t>Bibliografía</w:t>
-      </w:r>
-    </w:p>
-    <w:p>
-      <w:pPr>
-        <w:spacing w:before="83" w:after="240" w:line="276" w:lineRule="auto"/>
-        <w:ind w:left="1080" w:right="227"/>
-        <w:jc w:val="both"/>
-        <w:rPr>
-          <w:lang w:val="es-CL"/>
-        </w:rPr>
-      </w:pPr>
-    </w:p>
-    <w:p>
-      <w:pPr>
-        <w:spacing w:before="83" w:after="240" w:line="276" w:lineRule="auto"/>
-        <w:ind w:left="1080" w:right="227"/>
-        <w:jc w:val="both"/>
-        <w:rPr>
-          <w:lang w:val="es-CL"/>
-        </w:rPr>
-      </w:pPr>
-    </w:p>
-    <w:p>
-      <w:pPr>
-        <w:spacing w:before="83" w:after="240" w:line="276" w:lineRule="auto"/>
-        <w:ind w:left="1080" w:right="227"/>
-        <w:jc w:val="both"/>
-        <w:rPr>
-          <w:lang w:val="es-CL"/>
-        </w:rPr>
-      </w:pPr>
-    </w:p>
-    <w:p>
-      <w:pPr>
-        <w:spacing w:before="83" w:after="240" w:line="276" w:lineRule="auto"/>
-        <w:ind w:left="1080" w:right="227"/>
-        <w:jc w:val="both"/>
-        <w:rPr>
-          <w:lang w:val="es-CL"/>
-        </w:rPr>
-      </w:pPr>
-    </w:p>
-    <w:p>
-      <w:pPr>
-        <w:spacing w:before="83" w:after="240" w:line="276" w:lineRule="auto"/>
-        <w:ind w:left="1080" w:right="227"/>
-        <w:jc w:val="both"/>
-        <w:rPr>
-          <w:lang w:val="es-CL"/>
-        </w:rPr>
-      </w:pPr>
-    </w:p>
-    <w:p>
-      <w:pPr>
-        <w:spacing w:before="83" w:after="240" w:line="276" w:lineRule="auto"/>
-        <w:ind w:left="1080" w:right="227"/>
-        <w:jc w:val="both"/>
-        <w:rPr>
-          <w:lang w:val="es-CL"/>
-        </w:rPr>
-      </w:pPr>
-    </w:p>
-    <w:p>
-      <w:pPr>
-        <w:spacing w:before="83" w:after="240" w:line="276" w:lineRule="auto"/>
-        <w:ind w:left="1080" w:right="227"/>
-        <w:jc w:val="both"/>
-        <w:rPr>
-          <w:lang w:val="es-CL"/>
-        </w:rPr>
-      </w:pPr>
-    </w:p>
-    <w:p>
-      <w:pPr>
-        <w:spacing w:before="83" w:after="240" w:line="276" w:lineRule="auto"/>
-        <w:ind w:left="1080" w:right="227"/>
-        <w:jc w:val="both"/>
-        <w:rPr>
-          <w:lang w:val="es-CL"/>
-        </w:rPr>
-      </w:pPr>
-    </w:p>
-    <w:p>
-      <w:pPr>
-        <w:spacing w:before="83" w:after="240" w:line="276" w:lineRule="auto"/>
-        <w:ind w:left="1080" w:right="227"/>
-        <w:jc w:val="both"/>
-        <w:rPr>
-          <w:lang w:val="es-CL"/>
-        </w:rPr>
-      </w:pPr>
-    </w:p>
-    <w:p>
-      <w:pPr>
-        <w:spacing w:before="83" w:after="240" w:line="276" w:lineRule="auto"/>
-        <w:ind w:left="1080" w:right="227"/>
-        <w:jc w:val="both"/>
-        <w:rPr>
-          <w:lang w:val="es-CL"/>
-        </w:rPr>
-      </w:pPr>
-    </w:p>
-    <w:p>
-      <w:pPr>
-        <w:spacing w:before="83" w:after="240" w:line="276" w:lineRule="auto"/>
-        <w:ind w:left="1080" w:right="227"/>
-        <w:jc w:val="both"/>
-        <w:rPr>
-          <w:lang w:val="es-CL"/>
-        </w:rPr>
-      </w:pPr>
-    </w:p>
-    <w:p>
-      <w:pPr>
-        <w:spacing w:before="83" w:after="240" w:line="276" w:lineRule="auto"/>
-        <w:ind w:left="1080" w:right="227"/>
-        <w:jc w:val="both"/>
-        <w:rPr>
-          <w:lang w:val="es-CL"/>
-        </w:rPr>
-      </w:pPr>
-    </w:p>
-    <w:p>
-      <w:pPr>
-        <w:spacing w:before="120" w:after="240" w:line="276" w:lineRule="auto"/>
-        <w:ind w:right="227"/>
-      </w:pPr>
-    </w:p>
-    <w:p>
-      <w:pPr>
-        <w:spacing w:before="120" w:after="240" w:line="276" w:lineRule="auto"/>
-        <w:ind w:right="227"/>
-      </w:pPr>
-      <w:r>
-        <w:rPr>
-          <w:lang w:val="es-CL"/>
-        </w:rPr>
-        <w:t>Introducción y contextualización.</w:t>
-      </w:r>
-    </w:p>
-    <w:p>
-      <w:pPr>
-        <w:spacing w:before="120" w:after="240" w:line="276" w:lineRule="auto"/>
-        <w:ind w:right="227"/>
-      </w:pPr>
-      <w:r>
-        <w:t>Definición de la problemática y objetivos del proyecto. </w:t>
-      </w:r>
-    </w:p>
-    <w:p>
-      <w:pPr>
-        <w:spacing w:before="120" w:after="240" w:line="276" w:lineRule="auto"/>
-        <w:ind w:right="227"/>
-      </w:pPr>
-      <w:r>
-        <w:rPr>
-          <w:lang w:eastAsia="es-CL" w:bidi="es-ES"/>
-        </w:rPr>
-        <w:t>Aplicación de herramientas científicas.</w:t>
-      </w:r>
-    </w:p>
-    <w:p>
-      <w:pPr>
-        <w:spacing w:before="120" w:after="240" w:line="276" w:lineRule="auto"/>
-        <w:ind w:right="227"/>
-      </w:pPr>
-      <w:r>
-        <w:rPr>
-          <w:lang w:val="es-CL" w:bidi="es-ES"/>
-        </w:rPr>
-        <w:t>Reproducibilidad técnica. </w:t>
-      </w:r>
-    </w:p>
-    <w:p>
-      <w:pPr>
-        <w:spacing w:before="120" w:after="240" w:line="276" w:lineRule="auto"/>
-        <w:ind w:right="227"/>
-      </w:pPr>
-      <w:r>
-        <w:rPr>
-          <w:lang w:val="es-CL"/>
-        </w:rPr>
-        <w:t>Control de versiones</w:t>
-      </w:r>
-    </w:p>
-    <w:p>
-      <w:pPr>
-        <w:spacing w:before="120" w:after="240" w:line="276" w:lineRule="auto"/>
-        <w:ind w:right="227"/>
-        <w:rPr>
-          <w:lang w:val="en-US"/>
-        </w:rPr>
-      </w:pPr>
-      <w:r>
-        <w:rPr>
-          <w:lang w:val="en-US"/>
-        </w:rPr>
-        <w:t>Notebook F1_Definición.ipynb (F1)</w:t>
-      </w:r>
-    </w:p>
-    <w:p>
-      <w:pPr>
-        <w:spacing w:before="120" w:after="240" w:line="276" w:lineRule="auto"/>
-        <w:ind w:right="227"/>
-        <w:rPr>
-          <w:lang w:val="es-CL"/>
-        </w:rPr>
-      </w:pPr>
-      <w:r>
-        <w:rPr>
-          <w:lang w:val="es-CL"/>
-        </w:rPr>
-        <w:t>Documentación del proceso</w:t>
-      </w:r>
-    </w:p>
-    <w:p>
-      <w:pPr>
-        <w:spacing w:before="120" w:after="240" w:line="276" w:lineRule="auto"/>
-        <w:ind w:right="227"/>
-        <w:rPr>
-          <w:lang w:val="es-CL"/>
-        </w:rPr>
-      </w:pPr>
-      <w:r>
-        <w:rPr>
-          <w:lang w:val="es-CL"/>
-        </w:rPr>
-        <w:t>Repositorio GitHub correspondiente a la Fase 1</w:t>
-      </w:r>
-    </w:p>
-    <w:p>
-      <w:pPr>
-        <w:spacing w:before="120" w:after="240" w:line="276" w:lineRule="auto"/>
-        <w:ind w:right="227"/>
-        <w:rPr>
-          <w:lang w:val="es-CL"/>
-        </w:rPr>
-      </w:pPr>
-      <w:r>
-        <w:rPr>
-          <w:lang w:val="es-CL" w:bidi="es-ES"/>
-        </w:rPr>
-        <w:t>Vinculación del mapa conceptual con el avance de proyecto</w:t>
-      </w:r>
-    </w:p>
-    <w:p>
-      <w:pPr>
-        <w:spacing w:before="120" w:after="240" w:line="276" w:lineRule="auto"/>
-        <w:ind w:right="227"/>
-      </w:pPr>
-      <w:r>
-        <w:t>Bibliografía</w:t>
-      </w:r>
-    </w:p>
-    <w:p>
-      <w:pPr>
-        <w:spacing w:before="83" w:after="240" w:line="276" w:lineRule="auto"/>
-        <w:ind w:left="1080" w:right="227"/>
-        <w:jc w:val="both"/>
-        <w:rPr>
-          <w:lang w:val="es-CL"/>
-        </w:rPr>
-      </w:pPr>
+        <w:t>490d9209a10d387011d481b72b7891f26e997974ec2cf9dfc518aa4a08552232</w:t>
+      </w:r>
     </w:p>
     <w:sectPr>
-      <w:headerReference w:type="default" r:id="rId22"/>
-      <w:footerReference w:type="default" r:id="rId23"/>
+      <w:headerReference w:type="default" r:id="rId23"/>
+      <w:footerReference w:type="default" r:id="rId24"/>
       <w:pgSz w:w="12240" w:h="15840"/>
-      <w:pgMar w:top="1100" w:right="840" w:bottom="1340" w:left="1020" w:header="493" w:footer="1149" w:gutter="0"/>
+      <w:pgMar w:top="1123" w:right="835" w:bottom="1339" w:left="1022" w:header="432" w:footer="504" w:gutter="0"/>
       <w:cols w:space="720"/>
+      <w:titlePg/>
     </w:sectPr>
   </w:body>
 </w:document>
@@ -1744,6 +4093,7 @@
     <w:pPr>
       <w:pStyle w:val="Textoindependiente"/>
       <w:spacing w:line="14" w:lineRule="auto"/>
+      <w:jc w:val="right"/>
       <w:rPr>
         <w:sz w:val="20"/>
       </w:rPr>
@@ -1865,7 +4215,7 @@
             </wp:anchor>
           </w:drawing>
         </mc:Choice>
-        <mc:Fallback xmlns:pic="http://schemas.openxmlformats.org/drawingml/2006/picture" xmlns:a="http://schemas.openxmlformats.org/drawingml/2006/main">
+        <mc:Fallback xmlns:a="http://schemas.openxmlformats.org/drawingml/2006/main" xmlns:pic="http://schemas.openxmlformats.org/drawingml/2006/picture">
           <w:pict>
             <v:shape id="Graphic 17" style="position:absolute;margin-left:42.5pt;margin-top:739.9pt;width:218.15pt;height:.1pt;z-index:-15813632;visibility:visible;mso-wrap-style:square;mso-wrap-distance-left:0;mso-wrap-distance-top:0;mso-wrap-distance-right:0;mso-wrap-distance-bottom:0;mso-position-horizontal:absolute;mso-position-horizontal-relative:page;mso-position-vertical:absolute;mso-position-vertical-relative:page;v-text-anchor:top" coordsize="2770505,1270" o:spid="_x0000_s1026" filled="f" strokecolor="#1d4b63" path="m,l2770204,e" o:gfxdata="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" w14:anchorId="0747A2B0">
               <v:path arrowok="t"/>
@@ -1944,7 +4294,7 @@
             </wp:anchor>
           </w:drawing>
         </mc:Choice>
-        <mc:Fallback xmlns:pic="http://schemas.openxmlformats.org/drawingml/2006/picture" xmlns:a="http://schemas.openxmlformats.org/drawingml/2006/main">
+        <mc:Fallback xmlns:a="http://schemas.openxmlformats.org/drawingml/2006/main" xmlns:pic="http://schemas.openxmlformats.org/drawingml/2006/picture">
           <w:pict>
             <v:shape id="Graphic 18" style="position:absolute;margin-left:371.35pt;margin-top:739.9pt;width:198.15pt;height:.1pt;z-index:-15813120;visibility:visible;mso-wrap-style:square;mso-wrap-distance-left:0;mso-wrap-distance-top:0;mso-wrap-distance-right:0;mso-wrap-distance-bottom:0;mso-position-horizontal:absolute;mso-position-horizontal-relative:page;mso-position-vertical:absolute;mso-position-vertical-relative:page;v-text-anchor:top" coordsize="2516505,1270" o:spid="_x0000_s1026" filled="f" strokecolor="#1d4b63" path="m,l2516399,e" o:gfxdata="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" w14:anchorId="3C0EE5FF">
               <v:path arrowok="t"/>
@@ -1953,6 +4303,24 @@
           </w:pict>
         </mc:Fallback>
       </mc:AlternateContent>
+    </w:r>
+    <w:r>
+      <w:fldChar w:fldCharType="begin"/>
+    </w:r>
+    <w:r>
+      <w:instrText>PAGE</w:instrText>
+    </w:r>
+    <w:r>
+      <w:fldChar w:fldCharType="separate"/>
+    </w:r>
+    <w:r>
+      <w:rPr>
+        <w:noProof/>
+      </w:rPr>
+      <w:t>2</w:t>
+    </w:r>
+    <w:r>
+      <w:fldChar w:fldCharType="end"/>
     </w:r>
   </w:p>
 </w:ftr>
@@ -2005,7 +4373,7 @@
               <wp:extent cx="6692900" cy="115570"/>
               <wp:effectExtent l="0" t="0" r="0" b="0"/>
               <wp:wrapNone/>
-              <wp:docPr id="12" name="Group 12"/>
+              <wp:docPr id="1309427466" name="Group 12"/>
               <wp:cNvGraphicFramePr>
                 <a:graphicFrameLocks xmlns:a="http://schemas.openxmlformats.org/drawingml/2006/main"/>
               </wp:cNvGraphicFramePr>
@@ -2089,7 +4457,7 @@
             </wp:anchor>
           </w:drawing>
         </mc:Choice>
-        <mc:Fallback xmlns:pic="http://schemas.openxmlformats.org/drawingml/2006/picture" xmlns:a="http://schemas.openxmlformats.org/drawingml/2006/main">
+        <mc:Fallback xmlns:a="http://schemas.openxmlformats.org/drawingml/2006/main" xmlns:pic="http://schemas.openxmlformats.org/drawingml/2006/picture">
           <w:pict>
             <v:group id="Group 12" style="position:absolute;margin-left:42.5pt;margin-top:37.85pt;width:527pt;height:9.1pt;z-index:-15815168;mso-wrap-distance-left:0;mso-wrap-distance-right:0;mso-position-horizontal-relative:page;mso-position-vertical-relative:page" coordsize="66929,1155" o:spid="_x0000_s1026" w14:anchorId="58BDBA3A" o:gfxdata="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">
               <v:shape id="Graphic 13" style="position:absolute;left:539;top:551;width:66390;height:13;visibility:visible;mso-wrap-style:square;v-text-anchor:top" coordsize="6638925,1270" o:spid="_x0000_s1027" filled="f" strokecolor="#1d4b63" path="m,l6638404,e" o:gfxdata="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">
@@ -2167,13 +4535,11 @@
                             <w:spacing w:line="264" w:lineRule="exact"/>
                             <w:ind w:left="60"/>
                             <w:rPr>
-                              <w:rFonts w:ascii="Calibri"/>
                               <w:sz w:val="24"/>
                             </w:rPr>
                           </w:pPr>
                           <w:r>
                             <w:rPr>
-                              <w:rFonts w:ascii="Calibri"/>
                               <w:color w:val="231F20"/>
                               <w:sz w:val="24"/>
                             </w:rPr>
@@ -2181,7 +4547,6 @@
                           </w:r>
                           <w:r>
                             <w:rPr>
-                              <w:rFonts w:ascii="Calibri"/>
                               <w:color w:val="231F20"/>
                               <w:sz w:val="24"/>
                             </w:rPr>
@@ -2189,7 +4554,6 @@
                           </w:r>
                           <w:r>
                             <w:rPr>
-                              <w:rFonts w:ascii="Calibri"/>
                               <w:color w:val="231F20"/>
                               <w:sz w:val="24"/>
                             </w:rPr>
@@ -2197,7 +4561,6 @@
                           </w:r>
                           <w:r>
                             <w:rPr>
-                              <w:rFonts w:ascii="Calibri"/>
                               <w:color w:val="231F20"/>
                               <w:sz w:val="24"/>
                             </w:rPr>
@@ -2205,7 +4568,6 @@
                           </w:r>
                           <w:r>
                             <w:rPr>
-                              <w:rFonts w:ascii="Calibri"/>
                               <w:color w:val="231F20"/>
                               <w:sz w:val="24"/>
                             </w:rPr>
@@ -2237,13 +4599,11 @@
                       <w:spacing w:line="264" w:lineRule="exact"/>
                       <w:ind w:left="60"/>
                       <w:rPr>
-                        <w:rFonts w:ascii="Calibri"/>
                         <w:sz w:val="24"/>
                       </w:rPr>
                     </w:pPr>
                     <w:r>
                       <w:rPr>
-                        <w:rFonts w:ascii="Calibri"/>
                         <w:color w:val="231F20"/>
                         <w:sz w:val="24"/>
                       </w:rPr>
@@ -2251,7 +4611,6 @@
                     </w:r>
                     <w:r>
                       <w:rPr>
-                        <w:rFonts w:ascii="Calibri"/>
                         <w:color w:val="231F20"/>
                         <w:sz w:val="24"/>
                       </w:rPr>
@@ -2259,7 +4618,6 @@
                     </w:r>
                     <w:r>
                       <w:rPr>
-                        <w:rFonts w:ascii="Calibri"/>
                         <w:color w:val="231F20"/>
                         <w:sz w:val="24"/>
                       </w:rPr>
@@ -2267,7 +4625,6 @@
                     </w:r>
                     <w:r>
                       <w:rPr>
-                        <w:rFonts w:ascii="Calibri"/>
                         <w:color w:val="231F20"/>
                         <w:sz w:val="24"/>
                       </w:rPr>
@@ -2275,7 +4632,6 @@
                     </w:r>
                     <w:r>
                       <w:rPr>
-                        <w:rFonts w:ascii="Calibri"/>
                         <w:color w:val="231F20"/>
                         <w:sz w:val="24"/>
                       </w:rPr>
@@ -3464,8 +5820,12 @@
   <w:style w:type="paragraph" w:default="1" w:styleId="Normal">
     <w:name w:val="Normal"/>
     <w:qFormat/>
+    <w:pPr>
+      <w:spacing w:after="140" w:line="269" w:lineRule="auto"/>
+    </w:pPr>
     <w:rPr>
-      <w:rFonts w:ascii="Arial" w:eastAsia="Arial" w:hAnsi="Arial" w:cs="Arial"/>
+      <w:rFonts w:ascii="Calibri" w:eastAsia="Arial" w:hAnsi="Calibri" w:cs="Arial"/>
+      <w:color w:val="000000"/>
       <w:lang w:val="es-ES"/>
     </w:rPr>
   </w:style>
@@ -3530,7 +5890,7 @@
     <w:rPr>
       <w:b/>
       <w:bCs/>
-      <w:sz w:val="56"/>
+      <w:sz w:val="42"/>
       <w:szCs w:val="56"/>
     </w:rPr>
   </w:style>
@@ -3626,6 +5986,69 @@
     <w:rPr>
       <w:sz w:val="16"/>
       <w:szCs w:val="16"/>
+    </w:rPr>
+  </w:style>
+  <w:style w:type="paragraph" w:customStyle="1" w:styleId="Ttulo11">
+    <w:name w:val="Título 11"/>
+    <w:pPr>
+      <w:keepNext/>
+      <w:spacing w:after="140" w:line="269" w:lineRule="auto"/>
+      <w:outlineLvl w:val="0"/>
+    </w:pPr>
+    <w:rPr>
+      <w:rFonts w:ascii="Calibri" w:hAnsi="Calibri"/>
+      <w:color w:val="000000"/>
+      <w:sz w:val="30"/>
+    </w:rPr>
+  </w:style>
+  <w:style w:type="paragraph" w:customStyle="1" w:styleId="Ttulo21">
+    <w:name w:val="Título 21"/>
+    <w:pPr>
+      <w:keepNext/>
+      <w:spacing w:after="140" w:line="269" w:lineRule="auto"/>
+      <w:outlineLvl w:val="1"/>
+    </w:pPr>
+    <w:rPr>
+      <w:rFonts w:ascii="Calibri" w:hAnsi="Calibri"/>
+      <w:color w:val="000000"/>
+      <w:sz w:val="24"/>
+    </w:rPr>
+  </w:style>
+  <w:style w:type="paragraph" w:customStyle="1" w:styleId="Descripcin1">
+    <w:name w:val="Descripción1"/>
+    <w:pPr>
+      <w:spacing w:after="140" w:line="269" w:lineRule="auto"/>
+    </w:pPr>
+    <w:rPr>
+      <w:rFonts w:ascii="Calibri" w:hAnsi="Calibri"/>
+      <w:color w:val="000000"/>
+      <w:sz w:val="20"/>
+    </w:rPr>
+  </w:style>
+  <w:style w:type="paragraph" w:customStyle="1" w:styleId="Listaconvietas1">
+    <w:name w:val="Lista con viñetas1"/>
+  </w:style>
+  <w:style w:type="paragraph" w:styleId="TDC1">
+    <w:name w:val="toc 1"/>
+    <w:basedOn w:val="Normal"/>
+    <w:next w:val="Normal"/>
+    <w:autoRedefine/>
+    <w:uiPriority w:val="39"/>
+    <w:unhideWhenUsed/>
+    <w:rsid w:val="00424A70"/>
+    <w:pPr>
+      <w:spacing w:after="100"/>
+    </w:pPr>
+  </w:style>
+  <w:style w:type="character" w:styleId="Hipervnculo">
+    <w:name w:val="Hyperlink"/>
+    <w:basedOn w:val="Fuentedeprrafopredeter"/>
+    <w:uiPriority w:val="99"/>
+    <w:unhideWhenUsed/>
+    <w:rsid w:val="00424A70"/>
+    <w:rPr>
+      <w:color w:val="0000FF" w:themeColor="hyperlink"/>
+      <w:u w:val="single"/>
     </w:rPr>
   </w:style>
 </w:styles>
@@ -3915,10 +6338,6 @@
 </file>
 
 <file path=customXml/item1.xml><?xml version="1.0" encoding="utf-8"?>
-<b:Sources xmlns:b="http://schemas.openxmlformats.org/officeDocument/2006/bibliography" xmlns="http://schemas.openxmlformats.org/officeDocument/2006/bibliography" SelectedStyle="\APASixthEditionOfficeOnline.xsl" StyleName="APA" Version="6"/>
-</file>
-
-<file path=customXml/item2.xml><?xml version="1.0" encoding="utf-8"?>
 <?mso-contentType ?>
 <FormTemplates xmlns="http://schemas.microsoft.com/sharepoint/v3/contenttype/forms">
   <Display>DocumentLibraryForm</Display>
@@ -3927,7 +6346,40 @@
 </FormTemplates>
 </file>
 
+<file path=customXml/item2.xml><?xml version="1.0" encoding="utf-8"?>
+<b:Sources xmlns:b="http://schemas.openxmlformats.org/officeDocument/2006/bibliography" xmlns="http://schemas.openxmlformats.org/officeDocument/2006/bibliography" SelectedStyle="\APASixthEditionOfficeOnline.xsl" StyleName="APA" Version="6"/>
+</file>
+
 <file path=customXml/item3.xml><?xml version="1.0" encoding="utf-8"?>
+<p:properties xmlns:p="http://schemas.microsoft.com/office/2006/metadata/properties" xmlns:xsi="http://www.w3.org/2001/XMLSchema-instance" xmlns:pc="http://schemas.microsoft.com/office/infopath/2007/PartnerControls">
+  <documentManagement>
+    <_ApprovalAssignedTo xmlns="0a2fff00-f002-44e7-b50c-b90cb65110b9">
+      <UserInfo>
+        <DisplayName/>
+        <AccountId xsi:nil="true"/>
+        <AccountType/>
+      </UserInfo>
+    </_ApprovalAssignedTo>
+    <_ApprovalStatus xmlns="0a2fff00-f002-44e7-b50c-b90cb65110b9">0</_ApprovalStatus>
+    <_ApprovalRespondedBy xmlns="0a2fff00-f002-44e7-b50c-b90cb65110b9">
+      <UserInfo>
+        <DisplayName/>
+        <AccountId xsi:nil="true"/>
+        <AccountType/>
+      </UserInfo>
+    </_ApprovalRespondedBy>
+    <_ApprovalSentBy xmlns="0a2fff00-f002-44e7-b50c-b90cb65110b9">
+      <UserInfo>
+        <DisplayName/>
+        <AccountId xsi:nil="true"/>
+        <AccountType/>
+      </UserInfo>
+    </_ApprovalSentBy>
+  </documentManagement>
+</p:properties>
+</file>
+
+<file path=customXml/item4.xml><?xml version="1.0" encoding="utf-8"?>
 <ct:contentTypeSchema xmlns:ct="http://schemas.microsoft.com/office/2006/metadata/contentType" xmlns:ma="http://schemas.microsoft.com/office/2006/metadata/properties/metaAttributes" ct:_="" ma:_="" ma:contentTypeName="Documento" ma:contentTypeID="0x010100E4D0EA28D091FE4192BEFA8519B37564" ma:contentTypeVersion="7" ma:contentTypeDescription="Crear nuevo documento." ma:contentTypeScope="" ma:versionID="8260c90b1ed25191c73397d710d0b300">
   <xsd:schema xmlns:xsd="http://www.w3.org/2001/XMLSchema" xmlns:xs="http://www.w3.org/2001/XMLSchema" xmlns:p="http://schemas.microsoft.com/office/2006/metadata/properties" xmlns:ns2="0a2fff00-f002-44e7-b50c-b90cb65110b9" targetNamespace="http://schemas.microsoft.com/office/2006/metadata/properties" ma:root="true" ma:fieldsID="0fcc4b40ac5a1efab0a1fc825461417d" ns2:_="">
     <xsd:import namespace="0a2fff00-f002-44e7-b50c-b90cb65110b9"/>
@@ -4131,36 +6583,15 @@
 </ct:contentTypeSchema>
 </file>
 
-<file path=customXml/item4.xml><?xml version="1.0" encoding="utf-8"?>
-<p:properties xmlns:p="http://schemas.microsoft.com/office/2006/metadata/properties" xmlns:xsi="http://www.w3.org/2001/XMLSchema-instance" xmlns:pc="http://schemas.microsoft.com/office/infopath/2007/PartnerControls">
-  <documentManagement>
-    <_ApprovalAssignedTo xmlns="0a2fff00-f002-44e7-b50c-b90cb65110b9">
-      <UserInfo>
-        <DisplayName/>
-        <AccountId xsi:nil="true"/>
-        <AccountType/>
-      </UserInfo>
-    </_ApprovalAssignedTo>
-    <_ApprovalStatus xmlns="0a2fff00-f002-44e7-b50c-b90cb65110b9">0</_ApprovalStatus>
-    <_ApprovalRespondedBy xmlns="0a2fff00-f002-44e7-b50c-b90cb65110b9">
-      <UserInfo>
-        <DisplayName/>
-        <AccountId xsi:nil="true"/>
-        <AccountType/>
-      </UserInfo>
-    </_ApprovalRespondedBy>
-    <_ApprovalSentBy xmlns="0a2fff00-f002-44e7-b50c-b90cb65110b9">
-      <UserInfo>
-        <DisplayName/>
-        <AccountId xsi:nil="true"/>
-        <AccountType/>
-      </UserInfo>
-    </_ApprovalSentBy>
-  </documentManagement>
-</p:properties>
+<file path=customXml/itemProps1.xml><?xml version="1.0" encoding="utf-8"?>
+<ds:datastoreItem xmlns:ds="http://schemas.openxmlformats.org/officeDocument/2006/customXml" ds:itemID="{084C26D9-49C9-4ADB-A387-DA6079798921}">
+  <ds:schemaRefs>
+    <ds:schemaRef ds:uri="http://schemas.microsoft.com/sharepoint/v3/contenttype/forms"/>
+  </ds:schemaRefs>
+</ds:datastoreItem>
 </file>
 
-<file path=customXml/itemProps1.xml><?xml version="1.0" encoding="utf-8"?>
+<file path=customXml/itemProps2.xml><?xml version="1.0" encoding="utf-8"?>
 <ds:datastoreItem xmlns:ds="http://schemas.openxmlformats.org/officeDocument/2006/customXml" ds:itemID="{FACB83BB-458E-4CCB-91D7-35CFBA93934D}">
   <ds:schemaRefs>
     <ds:schemaRef ds:uri="http://schemas.openxmlformats.org/officeDocument/2006/bibliography"/>
@@ -4168,15 +6599,17 @@
 </ds:datastoreItem>
 </file>
 
-<file path=customXml/itemProps2.xml><?xml version="1.0" encoding="utf-8"?>
-<ds:datastoreItem xmlns:ds="http://schemas.openxmlformats.org/officeDocument/2006/customXml" ds:itemID="{084C26D9-49C9-4ADB-A387-DA6079798921}">
+<file path=customXml/itemProps3.xml><?xml version="1.0" encoding="utf-8"?>
+<ds:datastoreItem xmlns:ds="http://schemas.openxmlformats.org/officeDocument/2006/customXml" ds:itemID="{662F60C8-4BC5-4139-BE63-6954D22D77BD}">
   <ds:schemaRefs>
-    <ds:schemaRef ds:uri="http://schemas.microsoft.com/sharepoint/v3/contenttype/forms"/>
+    <ds:schemaRef ds:uri="http://schemas.microsoft.com/office/2006/metadata/properties"/>
+    <ds:schemaRef ds:uri="http://schemas.microsoft.com/office/infopath/2007/PartnerControls"/>
+    <ds:schemaRef ds:uri="0a2fff00-f002-44e7-b50c-b90cb65110b9"/>
   </ds:schemaRefs>
 </ds:datastoreItem>
 </file>
 
-<file path=customXml/itemProps3.xml><?xml version="1.0" encoding="utf-8"?>
+<file path=customXml/itemProps4.xml><?xml version="1.0" encoding="utf-8"?>
 <ds:datastoreItem xmlns:ds="http://schemas.openxmlformats.org/officeDocument/2006/customXml" ds:itemID="{CE4EBACF-5594-46F9-A2CF-C5555F399E1E}">
   <ds:schemaRefs>
     <ds:schemaRef ds:uri="http://schemas.microsoft.com/office/2006/metadata/contentType"/>
@@ -4192,14 +6625,4 @@
     <ds:schemaRef ds:uri="http://schemas.microsoft.com/internal/obd"/>
   </ds:schemaRefs>
 </ds:datastoreItem>
-</file>
-
-<file path=customXml/itemProps4.xml><?xml version="1.0" encoding="utf-8"?>
-<ds:datastoreItem xmlns:ds="http://schemas.openxmlformats.org/officeDocument/2006/customXml" ds:itemID="{662F60C8-4BC5-4139-BE63-6954D22D77BD}">
-  <ds:schemaRefs>
-    <ds:schemaRef ds:uri="http://schemas.microsoft.com/office/2006/metadata/properties"/>
-    <ds:schemaRef ds:uri="http://schemas.microsoft.com/office/infopath/2007/PartnerControls"/>
-    <ds:schemaRef ds:uri="0a2fff00-f002-44e7-b50c-b90cb65110b9"/>
-  </ds:schemaRefs>
-</ds:datastoreItem>
 </file>
</xml_diff>